<commit_message>
Hai website in kèm nội dung lồng ghép như app: QPAN, kĩ năng sống, STEM, đính chính SGK
Trước: website chỉ lấy cột "Nội dung điều chỉnh, bổ sung" ở dạng gốc, nên bản Word tải
về mỏng hơn bản giáo viên xuất từ app (app tự gắn thêm lồng ghép khi dựng bảng).
Đo được 1.414/4.326 dòng lệch. Nay bộ đẩy _khgd-app-to-web.py đọc _cot7-day.json —
cột 7 xuất ra từ chính app bằng _xuat-cot7-day.js với công tắc mặc định (bật Năng lực
số, QPAN, kĩ năng sống, STEM, đính chính; tắt AI, Việt–Lào, địa phương, HS khuyết tật).

Mã tích hợp trên website: QPAN 10 → 249, KNS 5 → 1.183, STEM 55 → 114.
Kèm bản vá Mĩ thuật lớp 1 tuần 2. Đo lại: 51/51 cặp khối×môn khớp app và khớp bản dùng chung.

Co-Authored-By: Claude Opus 5 <noreply@anthropic.com>
Claude-Session: https://claude.ai/code/session_01EQbWdA5TUDQ3hBC1ivA74a
</commit_message>
<xml_diff>
--- a/assets/docs/lop1/Am nhac - Lop 1.docx
+++ b/assets/docs/lop1/Am nhac - Lop 1.docx
@@ -1082,6 +1082,19 @@
               <w:t>NLS-AT: Âm lượng loa vừa phải; bản thu chỉ dùng tại lớp.</w:t>
             </w:r>
           </w:p>
+          <w:p>
+            <w:pPr>
+              <w:spacing w:after="0"/>
+            </w:pPr>
+            <w:r>
+              <w:rPr>
+                <w:b w:val="0"/>
+                <w:i w:val="0"/>
+                <w:sz w:val="18"/>
+              </w:rPr>
+              <w:t>KNS: KN tự tin biểu diễn trước tập thể và phối hợp cùng nhóm.</w:t>
+            </w:r>
+          </w:p>
         </w:tc>
         <w:tc>
           <w:tcPr>
@@ -1225,6 +1238,19 @@
               <w:t>NLS-AT: Bản thu lấy từ học liệu bộ sách; nêu tên tác giả.</w:t>
             </w:r>
           </w:p>
+          <w:p>
+            <w:pPr>
+              <w:spacing w:after="0"/>
+            </w:pPr>
+            <w:r>
+              <w:rPr>
+                <w:b w:val="0"/>
+                <w:i w:val="0"/>
+                <w:sz w:val="18"/>
+              </w:rPr>
+              <w:t>QPAN: Chọn bài hát ca ngợi quê hương, đất nước, hoà bình; liên hệ hình ảnh chú bộ đội Quân đội nhân dân, chú công an Công an nhân dân và di tích lịch sử ở địa phương.</w:t>
+            </w:r>
+          </w:p>
         </w:tc>
         <w:tc>
           <w:tcPr>
@@ -1368,6 +1394,19 @@
               <w:t>NLS-AT: Phim từ học liệu bộ sách, GV xem trước; loa vừa đủ nghe.</w:t>
             </w:r>
           </w:p>
+          <w:p>
+            <w:pPr>
+              <w:spacing w:after="0"/>
+            </w:pPr>
+            <w:r>
+              <w:rPr>
+                <w:b w:val="0"/>
+                <w:i w:val="0"/>
+                <w:sz w:val="18"/>
+              </w:rPr>
+              <w:t>QPAN: Chọn bài hát ca ngợi quê hương, đất nước, hoà bình; liên hệ hình ảnh chú bộ đội Quân đội nhân dân, chú công an Công an nhân dân và di tích lịch sử ở địa phương.</w:t>
+            </w:r>
+          </w:p>
         </w:tc>
         <w:tc>
           <w:tcPr>
@@ -1511,6 +1550,19 @@
               <w:t>NLS-AT: Quốc ca từ nguồn chính thức; đứng nghiêm khi nghe.</w:t>
             </w:r>
           </w:p>
+          <w:p>
+            <w:pPr>
+              <w:spacing w:after="0"/>
+            </w:pPr>
+            <w:r>
+              <w:rPr>
+                <w:b w:val="0"/>
+                <w:i w:val="0"/>
+                <w:sz w:val="18"/>
+              </w:rPr>
+              <w:t>QPAN: Cho HS nghe/hát bài hát về chú bộ đội, về Đội; giáo dục yêu quê hương, yêu hoà bình, yêu Tổ quốc Việt Nam xã hội chủ nghĩa.</w:t>
+            </w:r>
+          </w:p>
         </w:tc>
         <w:tc>
           <w:tcPr>
@@ -1654,6 +1706,19 @@
               <w:t>NLS-AT: Âm thanh từ học liệu có nguồn; loa vừa đủ, tránh âm chói tai.</w:t>
             </w:r>
           </w:p>
+          <w:p>
+            <w:pPr>
+              <w:spacing w:after="0"/>
+            </w:pPr>
+            <w:r>
+              <w:rPr>
+                <w:b w:val="0"/>
+                <w:i w:val="0"/>
+                <w:sz w:val="18"/>
+              </w:rPr>
+              <w:t>QPAN: Chọn bài hát ca ngợi quê hương, đất nước, hoà bình; liên hệ hình ảnh chú bộ đội Quân đội nhân dân, chú công an Công an nhân dân và di tích lịch sử ở địa phương.</w:t>
+            </w:r>
+          </w:p>
         </w:tc>
         <w:tc>
           <w:tcPr>
@@ -2224,6 +2289,19 @@
                 <w:sz w:val="18"/>
               </w:rPr>
               <w:t>NLS-AT: Không hét vào micro, loa vừa đủ, bản ghi chỉ dùng trong lớp.</w:t>
+            </w:r>
+          </w:p>
+          <w:p>
+            <w:pPr>
+              <w:spacing w:after="0"/>
+            </w:pPr>
+            <w:r>
+              <w:rPr>
+                <w:b w:val="0"/>
+                <w:i w:val="0"/>
+                <w:sz w:val="18"/>
+              </w:rPr>
+              <w:t>KNS: KN tự tin biểu diễn trước tập thể và phối hợp cùng nhóm.</w:t>
             </w:r>
           </w:p>
         </w:tc>
@@ -3537,6 +3615,19 @@
               <w:t>NLS-AT: Bản ghi chỉ dùng tại lớp, loa vừa đủ nghe.</w:t>
             </w:r>
           </w:p>
+          <w:p>
+            <w:pPr>
+              <w:spacing w:after="0"/>
+            </w:pPr>
+            <w:r>
+              <w:rPr>
+                <w:b w:val="0"/>
+                <w:i w:val="0"/>
+                <w:sz w:val="18"/>
+              </w:rPr>
+              <w:t>KNS: KN tự tin biểu diễn trước tập thể và phối hợp cùng nhóm.</w:t>
+            </w:r>
+          </w:p>
         </w:tc>
         <w:tc>
           <w:tcPr>
@@ -4109,6 +4200,19 @@
               <w:t>NLS-AT: Không nêu tên riêng, GV là người gửi.</w:t>
             </w:r>
           </w:p>
+          <w:p>
+            <w:pPr>
+              <w:spacing w:after="0"/>
+            </w:pPr>
+            <w:r>
+              <w:rPr>
+                <w:b w:val="0"/>
+                <w:i w:val="0"/>
+                <w:sz w:val="18"/>
+              </w:rPr>
+              <w:t>KNS: KN tự tin biểu diễn trước tập thể và phối hợp cùng nhóm.</w:t>
+            </w:r>
+          </w:p>
         </w:tc>
         <w:tc>
           <w:tcPr>
@@ -4679,6 +4783,19 @@
                 <w:sz w:val="18"/>
               </w:rPr>
               <w:t>NLS-AT: Đoạn quay chỉ xem tại lớp; học liệu bộ sách.</w:t>
+            </w:r>
+          </w:p>
+          <w:p>
+            <w:pPr>
+              <w:spacing w:after="0"/>
+            </w:pPr>
+            <w:r>
+              <w:rPr>
+                <w:b w:val="0"/>
+                <w:i w:val="0"/>
+                <w:sz w:val="18"/>
+              </w:rPr>
+              <w:t>KNS: KN tự tin biểu diễn trước tập thể và phối hợp cùng nhóm.</w:t>
             </w:r>
           </w:p>
         </w:tc>

</xml_diff>

<commit_message>
Hai website cập nhật theo kế hoạch tuần 3 mới (Năng lực số bám từng bài)
Sinh lại 51 tệp KHDH và bản Word đính kèm từ dữ liệu app sau khi 95 tiết tuần 3 được viết lại
khối Năng lực số và 125 ô cột "Nội dung điều chỉnh, bổ sung" của tuần 3 được tóm tắt từ giáo án.
Đo lại: 51/51 cặp khối×môn khớp app và khớp bản dùng chung.

Co-Authored-By: Claude Opus 5 <noreply@anthropic.com>
Claude-Session: https://claude.ai/code/session_01EQbWdA5TUDQ3hBC1ivA74a
</commit_message>
<xml_diff>
--- a/assets/docs/lop1/Am nhac - Lop 1.docx
+++ b/assets/docs/lop1/Am nhac - Lop 1.docx
@@ -910,7 +910,7 @@
                 <w:i w:val="0"/>
                 <w:sz w:val="18"/>
               </w:rPr>
-              <w:t>NLS-KT (Cơ bản 1): GV chiếu bậc thang Đô – Rê – Mi, ô nốt sáng lên khi đàn; HS nhìn – nghe, nói tên nốt, nốt cao – thấp</w:t>
+              <w:t>NLS-KT (Cơ bản 1): GV chiếu hình bậc thang Đô – Rê – Mi từ học liệu số</w:t>
             </w:r>
           </w:p>
           <w:p>
@@ -923,7 +923,7 @@
                 <w:i w:val="0"/>
                 <w:sz w:val="18"/>
               </w:rPr>
-              <w:t>NLS-ST (Cơ bản 1): GV quay đoạn lớp đọc nhạc kèm kí hiệu tay, mở lại để HS tự sửa</w:t>
+              <w:t>NLS-ST (Cơ bản 1): GV quay đoạn ngắn cả lớp đọc Đô – Rê – Mi kết hợp kí hiệu bàn tay</w:t>
             </w:r>
           </w:p>
           <w:p>
@@ -936,7 +936,7 @@
                 <w:i w:val="0"/>
                 <w:sz w:val="18"/>
               </w:rPr>
-              <w:t>NLS-AT: Học liệu từ bộ sách; đoạn quay chỉ dùng tại lớp, không đăng mạng.</w:t>
+              <w:t>NLS-AT: Hình ảnh và âm thanh lấy từ học liệu của bộ sách; đoạn quay chỉ dùng tại lớp</w:t>
             </w:r>
           </w:p>
         </w:tc>

</xml_diff>

<commit_message>
Hai website theo bản kế hoạch đã lọc Năng lực số về đúng nguyên tắc địa chỉ tích hợp
Sinh lại 51 tệp KHDH và Word đính kèm sau khi gỡ 1.591 khối Năng lực số khỏi các tiết ôn tập,
kiểm tra, sinh hoạt và các tiết không phải tiết đầu của bài. Mã trên website: NLS 3.372,
QPAN 249, KNS 1.170, STEM 115. Đo lại: 51/51 cặp khối x môn khớp app và khớp bản dùng chung.

Co-Authored-By: Claude Opus 5 <noreply@anthropic.com>
Claude-Session: https://claude.ai/code/session_01EQbWdA5TUDQ3hBC1ivA74a
</commit_message>
<xml_diff>
--- a/assets/docs/lop1/Am nhac - Lop 1.docx
+++ b/assets/docs/lop1/Am nhac - Lop 1.docx
@@ -624,7 +624,7 @@
                 <w:i w:val="0"/>
                 <w:sz w:val="18"/>
               </w:rPr>
-              <w:t>NLS-KT (Cơ bản 1): GV mở bản hát mẫu “Vào rừng hoa” từ học liệu số, chiếu tên bài, tác giả Việt Anh; HS nghe từng câu rồi hát nối tiếp</w:t>
+              <w:t>NLS-KT (Cơ bản 1): GV mở bản hát mẫu bài “Vào rừng hoa” từ học liệu số của bộ sách</w:t>
             </w:r>
           </w:p>
           <w:p>
@@ -637,7 +637,7 @@
                 <w:i w:val="0"/>
                 <w:sz w:val="18"/>
               </w:rPr>
-              <w:t>NLS-ST (Cơ bản 1): GV ghi âm cả lớp hát kết hợp vỗ tay theo phách, mở lại qua loa; HS chỉ chỗ hát chưa rõ</w:t>
+              <w:t>NLS-ST (Cơ bản 1): GV dùng điện thoại ghi âm phần cả lớp hát kết hợp vỗ tay theo phách rồi mở lại qua loa ngay tại lớp</w:t>
             </w:r>
           </w:p>
           <w:p>
@@ -650,7 +650,7 @@
                 <w:i w:val="0"/>
                 <w:sz w:val="18"/>
               </w:rPr>
-              <w:t>NLS-AT: Bản thu lấy từ học liệu bộ sách; nêu tên tác giả.</w:t>
+              <w:t>NLS-AT: Bản thu chỉ lấy từ học liệu của bộ sách hoặc kênh chính thức</w:t>
             </w:r>
           </w:p>
         </w:tc>
@@ -767,7 +767,7 @@
                 <w:i w:val="0"/>
                 <w:sz w:val="18"/>
               </w:rPr>
-              <w:t>NLS-KT (Cơ bản 1): GV mở các đoạn âm thanh tự nhiên và nhạc cụ từ học liệu số; HS nghe, nói tên âm thanh, chỉ tranh tương ứng</w:t>
+              <w:t>NLS-KT (Cơ bản 1): GV mở lần lượt các đoạn âm thanh tự nhiên (chim hót, gió, mưa, suối chảy) và âm thanh nhạc cụ (trống, đàn) từ học liệu số</w:t>
             </w:r>
           </w:p>
           <w:p>
@@ -780,7 +780,7 @@
                 <w:i w:val="0"/>
                 <w:sz w:val="18"/>
               </w:rPr>
-              <w:t>NLS-ST (Cơ bản 1): GV ghi âm "cơn mưa rừng" của lớp, mở lại qua loa; HS nhận xét to – nhỏ</w:t>
+              <w:t>NLS-ST (Cơ bản 1): GV ghi âm phần cả lớp tạo "cơn mưa rừng" bằng tay chân, mở lại qua loa; HS nghe và nhận xét đoạn nào nghe giống mưa nhỏ</w:t>
             </w:r>
           </w:p>
           <w:p>
@@ -793,7 +793,7 @@
                 <w:i w:val="0"/>
                 <w:sz w:val="18"/>
               </w:rPr>
-              <w:t>NLS-AT: Âm thanh lấy từ học liệu có nguồn; mở loa vừa đủ nghe.</w:t>
+              <w:t>NLS-AT: Các tệp âm thanh lấy từ học liệu của bộ sách hoặc kho âm thanh miễn phí có</w:t>
             </w:r>
           </w:p>
         </w:tc>
@@ -1053,7 +1053,7 @@
                 <w:i w:val="0"/>
                 <w:sz w:val="18"/>
               </w:rPr>
-              <w:t>NLS-ST (Cơ bản 1): GV ghi âm lớp đọc Đô – Rê – Mi to – nhỏ, mở lại qua loa; HS nói đoạn nào to, nhỏ và làm lại</w:t>
+              <w:t>NLS-ST (Cơ bản 1): GV dùng điện thoại ghi âm phần cả lớp đọc Đô – Rê – Mi lần to, lần nhỏ rồi mở lại qua loa</w:t>
             </w:r>
           </w:p>
           <w:p>
@@ -1066,7 +1066,7 @@
                 <w:i w:val="0"/>
                 <w:sz w:val="18"/>
               </w:rPr>
-              <w:t>NLS-KT (Cơ bản 1): GV mở đoạn nhạc có chỗ to – nhỏ kèm hình loa; HS giơ tay cao – thấp theo nhạc</w:t>
+              <w:t>NLS-KT (Cơ bản 1): GV mở một đoạn nhạc ngắn từ học liệu số có chỗ to, chỗ nhỏ, chiếu hình "loa to" – "loa nhỏ" thay đổi theo nhạc</w:t>
             </w:r>
           </w:p>
           <w:p>
@@ -1079,7 +1079,7 @@
                 <w:i w:val="0"/>
                 <w:sz w:val="18"/>
               </w:rPr>
-              <w:t>NLS-AT: Âm lượng loa vừa phải; bản thu chỉ dùng tại lớp.</w:t>
+              <w:t>NLS-AT: GV chỉnh âm lượng loa vừa phải, không tăng quá to khi minh họa "to"</w:t>
             </w:r>
           </w:p>
           <w:p>
@@ -1209,7 +1209,7 @@
                 <w:i w:val="0"/>
                 <w:sz w:val="18"/>
               </w:rPr>
-              <w:t>NLS-KT (Cơ bản 1): GV mở bản hát mẫu “Tổ quốc ta” từ học liệu số, chiếu tên bài, tác giả Mộng Lân; HS nghe từng câu rồi hát nối tiếp</w:t>
+              <w:t>NLS-KT (Cơ bản 1): GV mở bản hát mẫu bài “Tổ quốc ta” từ học liệu số của bộ sách</w:t>
             </w:r>
           </w:p>
           <w:p>
@@ -1222,7 +1222,7 @@
                 <w:i w:val="0"/>
                 <w:sz w:val="18"/>
               </w:rPr>
-              <w:t>NLS-ST (Cơ bản 1): GV ghi âm cả lớp hát kết hợp gõ phách, mở lại qua loa; HS chỉ chỗ hát chưa rõ</w:t>
+              <w:t>NLS-ST (Cơ bản 1): GV dùng điện thoại ghi âm phần cả lớp hát kết hợp gõ phách rồi mở lại qua loa ngay tại lớp</w:t>
             </w:r>
           </w:p>
           <w:p>
@@ -1235,7 +1235,7 @@
                 <w:i w:val="0"/>
                 <w:sz w:val="18"/>
               </w:rPr>
-              <w:t>NLS-AT: Bản thu lấy từ học liệu bộ sách; nêu tên tác giả.</w:t>
+              <w:t>NLS-AT: Bản thu chỉ lấy từ học liệu của bộ sách hoặc kênh chính thức</w:t>
             </w:r>
           </w:p>
           <w:p>
@@ -1365,7 +1365,7 @@
                 <w:i w:val="0"/>
                 <w:sz w:val="18"/>
               </w:rPr>
-              <w:t>NLS-KT (Cơ bản 1): GV mở phim ngắn về đội trống thiếu nhi và phát tiếng trống mẫu theo tiết tấu đen – đen – trắng; HS nói cách cầm dùi, gõ theo</w:t>
+              <w:t>NLS-KT (Cơ bản 1): GV mở đoạn phim ngắn từ học liệu số về đội trống của thiếu nhi (đeo trống, cầm dùi, gõ đều)</w:t>
             </w:r>
           </w:p>
           <w:p>
@@ -1378,7 +1378,7 @@
                 <w:i w:val="0"/>
                 <w:sz w:val="18"/>
               </w:rPr>
-              <w:t>NLS-ST (Cơ bản 1): GV ghi âm nhóm gõ trống, mở lại; HS nhận xét tiếng gõ đều chưa</w:t>
+              <w:t>NLS-ST (Cơ bản 1): GV ghi âm phần nhóm gõ trống con theo hình tiết tấu và mở lại qua loa; HS nghe xem tiếng gõ đã đều chưa</w:t>
             </w:r>
           </w:p>
           <w:p>
@@ -1391,7 +1391,7 @@
                 <w:i w:val="0"/>
                 <w:sz w:val="18"/>
               </w:rPr>
-              <w:t>NLS-AT: Phim từ học liệu bộ sách, GV xem trước; loa vừa đủ nghe.</w:t>
+              <w:t>NLS-AT: Đoạn phim lấy từ học liệu của bộ sách hoặc kênh chính thức, GV xem trước</w:t>
             </w:r>
           </w:p>
           <w:p>
@@ -1521,7 +1521,7 @@
                 <w:i w:val="0"/>
                 <w:sz w:val="18"/>
               </w:rPr>
-              <w:t>NLS-KT (Cơ bản 1): GV mở Quốc ca từ học liệu chính thức, chiếu lá cờ và tên nhạc sĩ Văn Cao; HS nói tên bài, tác giả, chỉ tư thế chào cờ đúng</w:t>
+              <w:t>NLS-KT (Cơ bản 1): GV mở bản thu Quốc ca từ học liệu chính thức, chiếu hình lá cờ Tổ quốc và tên nhạc sĩ Văn Cao</w:t>
             </w:r>
           </w:p>
           <w:p>
@@ -1534,7 +1534,7 @@
                 <w:i w:val="0"/>
                 <w:sz w:val="18"/>
               </w:rPr>
-              <w:t>NLS-ST (Cơ bản 1): GV ghi âm nhóm hát Tổ quốc ta có trống con đệm, mở lại; HS nhận xét tiếng trống</w:t>
+              <w:t>NLS-ST (Cơ bản 1): GV ghi âm phần nhóm hát Tổ quốc ta có gõ trống con đệm theo phách, mở lại qua loa</w:t>
             </w:r>
           </w:p>
           <w:p>
@@ -1547,7 +1547,7 @@
                 <w:i w:val="0"/>
                 <w:sz w:val="18"/>
               </w:rPr>
-              <w:t>NLS-AT: Quốc ca từ nguồn chính thức; đứng nghiêm khi nghe.</w:t>
+              <w:t>NLS-AT: Bản Quốc ca phải lấy từ nguồn chính thức, không dùng bản phối lạ</w:t>
             </w:r>
           </w:p>
           <w:p>
@@ -1677,7 +1677,7 @@
                 <w:i w:val="0"/>
                 <w:sz w:val="18"/>
               </w:rPr>
-              <w:t>NLS-KT (Cơ bản 1): GV mở các đoạn âm thanh cao – thấp và tiếng đàn kèm mũi tên lên – xuống; HS nghe – nhìn, nói âm cao – thấp, giơ tay theo</w:t>
+              <w:t>NLS-KT (Cơ bản 1): GV mở từ học liệu số các đoạn âm thanh cao – thấp (tiếng chim, tiếng bò, tiếng sáo, tiếng trống) và tiếng đàn các nốt</w:t>
             </w:r>
           </w:p>
           <w:p>
@@ -1690,7 +1690,7 @@
                 <w:i w:val="0"/>
                 <w:sz w:val="18"/>
               </w:rPr>
-              <w:t>NLS-ST (Cơ bản 1): GV ghi âm lớp hát "la" nhắc lại mẫu, mở lại; HS nhận xét đúng cao độ chưa</w:t>
+              <w:t>NLS-ST (Cơ bản 1): GV ghi âm phần cả lớp hát "la" nhắc lại mẫu cao – thấp và mở lại qua loa</w:t>
             </w:r>
           </w:p>
           <w:p>
@@ -1703,7 +1703,7 @@
                 <w:i w:val="0"/>
                 <w:sz w:val="18"/>
               </w:rPr>
-              <w:t>NLS-AT: Âm thanh từ học liệu có nguồn; loa vừa đủ, tránh âm chói tai.</w:t>
+              <w:t>NLS-AT: Âm thanh lấy từ học liệu của bộ sách hoặc kho âm thanh có ghi rõ nguồn</w:t>
             </w:r>
           </w:p>
           <w:p>
@@ -1833,7 +1833,7 @@
                 <w:i w:val="0"/>
                 <w:sz w:val="18"/>
               </w:rPr>
-              <w:t>NLS-KT (Cơ bản 1): GV mở bản hát mẫu “Lớp Một thân yêu” từ học liệu số, chiếu tên bài, tác giả Bùi Anh Tôn; HS nghe từng câu rồi hát nối tiếp</w:t>
+              <w:t>NLS-KT (Cơ bản 1): GV mở bản hát mẫu bài “Lớp Một thân yêu” từ học liệu số của bộ sách</w:t>
             </w:r>
           </w:p>
           <w:p>
@@ -1846,7 +1846,7 @@
                 <w:i w:val="0"/>
                 <w:sz w:val="18"/>
               </w:rPr>
-              <w:t>NLS-ST (Cơ bản 1): GV ghi âm cả lớp hát kết hợp vỗ tay theo phách, mở lại qua loa; HS chỉ chỗ hát chưa rõ</w:t>
+              <w:t>NLS-ST (Cơ bản 1): GV dùng điện thoại ghi âm phần cả lớp hát kết hợp vỗ tay theo phách rồi mở lại qua loa ngay tại lớp</w:t>
             </w:r>
           </w:p>
           <w:p>
@@ -1859,7 +1859,7 @@
                 <w:i w:val="0"/>
                 <w:sz w:val="18"/>
               </w:rPr>
-              <w:t>NLS-AT: Bản thu lấy từ học liệu bộ sách; nêu tên tác giả.</w:t>
+              <w:t>NLS-AT: Bản thu chỉ lấy từ học liệu của bộ sách hoặc kênh chính thức</w:t>
             </w:r>
           </w:p>
         </w:tc>
@@ -1976,7 +1976,7 @@
                 <w:i w:val="0"/>
                 <w:sz w:val="18"/>
               </w:rPr>
-              <w:t>NLS-KT (Cơ bản 1): GV chiếu hình kí hiệu bàn tay Đô – Rê – Mi, bật âm mẫu từng nốt; HS nhìn hình, nghe và đọc đúng tên nốt</w:t>
+              <w:t>NLS-KT (Cơ bản 1): GV chiếu hình ba kí hiệu bàn tay Đô – Rê – Mi lấy từ học liệu số của bộ sách</w:t>
             </w:r>
           </w:p>
           <w:p>
@@ -1989,7 +1989,7 @@
                 <w:i w:val="0"/>
                 <w:sz w:val="18"/>
               </w:rPr>
-              <w:t>NLS-ST (Cơ bản 1): GV quay ngắn phần “ban nhạc” của một nhóm, mở lại; HS xem và sửa kí hiệu bàn tay</w:t>
+              <w:t>NLS-ST (Cơ bản 1): GV dùng điện thoại quay ngắn phần “ban nhạc Đô – Rê – Mi” của một nhóm rồi mở lại trên màn hình</w:t>
             </w:r>
           </w:p>
           <w:p>
@@ -2002,7 +2002,7 @@
                 <w:i w:val="0"/>
                 <w:sz w:val="18"/>
               </w:rPr>
-              <w:t>NLS-AT: Học liệu lấy từ bộ sách; đoạn quay chỉ dùng tại lớp.</w:t>
+              <w:t>NLS-AT: Âm mẫu và hình kí hiệu bàn tay lấy từ học liệu của bộ sách</w:t>
             </w:r>
           </w:p>
         </w:tc>
@@ -2119,7 +2119,7 @@
                 <w:i w:val="0"/>
                 <w:sz w:val="18"/>
               </w:rPr>
-              <w:t>NLS-KT (Cơ bản 1): GV mở bản thu “Những bông hoa những bài ca”, chiếu tên bài, tác giả Hoàng Long; HS nghe, nêu cảm nhận vui hay buồn; NLS</w:t>
+              <w:t>NLS-KT (Cơ bản 1): GV mở bản thu bài “Những bông hoa những bài ca” từ học liệu số</w:t>
             </w:r>
           </w:p>
           <w:p>
@@ -2132,7 +2132,7 @@
                 <w:i w:val="0"/>
                 <w:sz w:val="18"/>
               </w:rPr>
-              <w:t>AI-NB (Cơ bản 1): GV bật từng nốt trên phần mềm đàn phím, máy hiện tên nốt; HS đọc và đối chiếu kí hiệu bàn tay</w:t>
+              <w:t>AI-NB (Cơ bản 1): GV dùng phần mềm đàn phím trên máy tính bật từng nốt Đô, Rê, Mi để HS đọc lại</w:t>
             </w:r>
           </w:p>
           <w:p>
@@ -2145,7 +2145,7 @@
                 <w:i w:val="0"/>
                 <w:sz w:val="18"/>
               </w:rPr>
-              <w:t>NLS-AT: Bản thu từ học liệu bộ sách; loa vừa đủ nghe.</w:t>
+              <w:t>NLS-AT: Bản thu lấy từ học liệu của bộ sách hoặc kênh chính thức, nêu rõ tên tác giả</w:t>
             </w:r>
           </w:p>
         </w:tc>
@@ -2262,7 +2262,7 @@
                 <w:i w:val="0"/>
                 <w:sz w:val="18"/>
               </w:rPr>
-              <w:t>NLS-KT (Cơ bản 1): GV mở ứng dụng ghi âm có sóng âm, HS đọc “la” to – nhỏ rồi nhìn sóng lớn – nhỏ; nghe âm mẫu cao – thấp</w:t>
+              <w:t>NLS-KT (Cơ bản 1): GV mở ứng dụng ghi âm có hình sóng âm trên màn hình, cho cả lớp đọc “la” to rồi nhỏ</w:t>
             </w:r>
           </w:p>
           <w:p>
@@ -2275,7 +2275,7 @@
                 <w:i w:val="0"/>
                 <w:sz w:val="18"/>
               </w:rPr>
-              <w:t>NLS-ST (Cơ bản 1): GV ghi âm nhóm đọc Đô – Rê – Mi to – nhỏ, mở lại; HS nhận xét</w:t>
+              <w:t>NLS-ST (Cơ bản 1): GV ghi âm một nhóm đọc câu nhạc Đô – Rê – Mi to – nhỏ theo hình, mở lại qua loa</w:t>
             </w:r>
           </w:p>
           <w:p>
@@ -2288,7 +2288,7 @@
                 <w:i w:val="0"/>
                 <w:sz w:val="18"/>
               </w:rPr>
-              <w:t>NLS-AT: Không hét vào micro, loa vừa đủ, bản ghi chỉ dùng trong lớp.</w:t>
+              <w:t>NLS-AT: Không để HS hét quá to vào micro; loa mở vừa đủ nghe, không để sát tai</w:t>
             </w:r>
           </w:p>
           <w:p>
@@ -2418,7 +2418,7 @@
                 <w:i w:val="0"/>
                 <w:sz w:val="18"/>
               </w:rPr>
-              <w:t>NLS-KT (Cơ bản 1): GV mở bản hát mẫu “Chào người bạn mới đến”, chiếu tên bài, tác giả; HS nghe từng câu rồi hát nối tiếp</w:t>
+              <w:t>NLS-KT (Cơ bản 1): GV mở bản hát mẫu bài “Chào người bạn mới đến” từ học liệu số, chiếu màn hình có tên bài và tên tác giả Lương Bằng Vinh</w:t>
             </w:r>
           </w:p>
           <w:p>
@@ -2431,7 +2431,7 @@
                 <w:i w:val="0"/>
                 <w:sz w:val="18"/>
               </w:rPr>
-              <w:t>NLS-GT (Cơ bản 1): GV quay lớp hát kết hợp động tác chào, mở lại, gửi nhóm lớp khi được đồng ý; HS nói lời chào gửi cha mẹ</w:t>
+              <w:t>NLS-GT (Cơ bản 1): GV dùng điện thoại quay đoạn cả lớp hát kết hợp động tác chào bạn, mở lại trên màn hình để HS xem</w:t>
             </w:r>
           </w:p>
           <w:p>
@@ -2444,7 +2444,7 @@
                 <w:i w:val="0"/>
                 <w:sz w:val="18"/>
               </w:rPr>
-              <w:t>NLS-AT: Học liệu bộ sách; không đăng công khai.</w:t>
+              <w:t>NLS-AT: Bản hát mẫu lấy từ học liệu của bộ sách hoặc kênh chính thức</w:t>
             </w:r>
           </w:p>
         </w:tc>
@@ -2561,7 +2561,7 @@
                 <w:i w:val="0"/>
                 <w:sz w:val="18"/>
               </w:rPr>
-              <w:t>NLS-KT (Cơ bản 1): GV mở video cách cầm, gõ trống con, dừng hình tư thế cầm dùi; HS nhìn, làm theo, nhận ra tiếng trống</w:t>
+              <w:t>NLS-KT (Cơ bản 1): GV mở video ngắn từ học liệu số giới thiệu cách cầm và gõ trống con</w:t>
             </w:r>
           </w:p>
           <w:p>
@@ -2574,7 +2574,7 @@
                 <w:i w:val="0"/>
                 <w:sz w:val="18"/>
               </w:rPr>
-              <w:t>NLS-ST (Cơ bản 1): GV ghi âm lớp hát kết hợp gõ trống đệm, mở lại; HS nhận xét tiếng trống đều phách chưa</w:t>
+              <w:t>NLS-ST (Cơ bản 1): GV dùng điện thoại ghi âm phần cả lớp hát kết hợp gõ trống đệm theo phách, mở lại qua loa</w:t>
             </w:r>
           </w:p>
           <w:p>
@@ -2587,7 +2587,7 @@
                 <w:i w:val="0"/>
                 <w:sz w:val="18"/>
               </w:rPr>
-              <w:t>NLS-AT: Học liệu bộ sách; không gõ sát tai bạn; bản ghi chỉ dùng trong lớp.</w:t>
+              <w:t>NLS-AT: Video và âm thanh mẫu lấy từ học liệu của bộ sách; loa mở vừa đủ nghe</w:t>
             </w:r>
           </w:p>
         </w:tc>
@@ -2704,7 +2704,7 @@
                 <w:i w:val="0"/>
                 <w:sz w:val="18"/>
               </w:rPr>
-              <w:t>NLS-KT (Cơ bản 1): GV chiếu hình, video trống cái, bật tiếng trống cái – trống con; HS nghe, chỉ đúng hình; chiếu tên “Vũ khúc thiên nga”, Trai-cốp-xki; NLS</w:t>
+              <w:t>NLS-KT (Cơ bản 1): GV chiếu hình và video ngắn trống cái ở trường học, lễ hội lấy từ học liệu số</w:t>
             </w:r>
           </w:p>
           <w:p>
@@ -2717,7 +2717,7 @@
                 <w:i w:val="0"/>
                 <w:sz w:val="18"/>
               </w:rPr>
-              <w:t>AI-NB (Cơ bản 1): GV mở đoạn giới thiệu ngắn do AI đọc về Hồ thiên nga (đã kiểm tra); HS nghe, trả lời</w:t>
+              <w:t>AI-NB (Cơ bản 1): GV chuẩn bị trước một đoạn giới thiệu ngắn 2–3 câu về đàn thiên nga trong vở ba lê Hồ thiên nga do trợ lí AI đọc bằng</w:t>
             </w:r>
           </w:p>
           <w:p>
@@ -2730,7 +2730,7 @@
                 <w:i w:val="0"/>
                 <w:sz w:val="18"/>
               </w:rPr>
-              <w:t>NLS-AT: Học liệu bộ sách; GV duyệt nội dung AI.</w:t>
+              <w:t>NLS-AT: Hình, video, bản thu lấy từ học liệu của bộ sách hoặc kênh chính thức</w:t>
             </w:r>
           </w:p>
         </w:tc>
@@ -2847,33 +2847,6 @@
                 <w:i w:val="0"/>
                 <w:sz w:val="18"/>
               </w:rPr>
-              <w:t>NLS-KT (Cơ bản 1): GV chiếu tranh 4 bài hát kèm nhạc dạo, hình 2 mẫu tiết tấu; HS nhìn, nghe, nói tên bài, gõ theo</w:t>
-            </w:r>
-          </w:p>
-          <w:p>
-            <w:pPr>
-              <w:spacing w:after="0"/>
-            </w:pPr>
-            <w:r>
-              <w:rPr>
-                <w:b w:val="0"/>
-                <w:i w:val="0"/>
-                <w:sz w:val="18"/>
-              </w:rPr>
-              <w:t>NLS-ST (Cơ bản 1): GV quay phần tốp ca, song ca, mở lại; HS xem, nói điều cần sửa</w:t>
-            </w:r>
-          </w:p>
-          <w:p>
-            <w:pPr>
-              <w:spacing w:after="0"/>
-            </w:pPr>
-            <w:r>
-              <w:rPr>
-                <w:b w:val="0"/>
-                <w:i w:val="0"/>
-                <w:sz w:val="18"/>
-              </w:rPr>
-              <w:t>NLS-AT: Học liệu bộ sách; đoạn quay chỉ dùng trong lớp.</w:t>
             </w:r>
           </w:p>
         </w:tc>
@@ -2990,33 +2963,6 @@
                 <w:i w:val="0"/>
                 <w:sz w:val="18"/>
               </w:rPr>
-              <w:t>NLS-ST (Cơ bản 1): GV quay phần trình bày từng nhóm, mở lại đoạn tiêu biểu; HS xem, tự nói mình đạt mức Biết, Hiểu hay Vận dụng</w:t>
-            </w:r>
-          </w:p>
-          <w:p>
-            <w:pPr>
-              <w:spacing w:after="0"/>
-            </w:pPr>
-            <w:r>
-              <w:rPr>
-                <w:b w:val="0"/>
-                <w:i w:val="0"/>
-                <w:sz w:val="18"/>
-              </w:rPr>
-              <w:t>NLS-GT (Cơ bản 1): Đoạn quay gửi nhóm lớp cho cha mẹ khi được đồng ý; HS nói lời nhắn</w:t>
-            </w:r>
-          </w:p>
-          <w:p>
-            <w:pPr>
-              <w:spacing w:after="0"/>
-            </w:pPr>
-            <w:r>
-              <w:rPr>
-                <w:b w:val="0"/>
-                <w:i w:val="0"/>
-                <w:sz w:val="18"/>
-              </w:rPr>
-              <w:t>NLS-AT: HS không cầm thiết bị; không đăng công khai.</w:t>
             </w:r>
           </w:p>
         </w:tc>
@@ -3133,7 +3079,7 @@
                 <w:i w:val="0"/>
                 <w:sz w:val="18"/>
               </w:rPr>
-              <w:t>NLS-KT (Cơ bản 1): GV mở bản hát mẫu “Xúc xắc xúc xẻ” từ học liệu số, chiếu tên bài, tên tác giả; HS nghe từng câu rồi hát nối tiếp</w:t>
+              <w:t>NLS-KT (Cơ bản 1): GV mở bản hát mẫu bài “Xúc xắc xúc xẻ” từ học liệu số, chiếu màn hình có tên bài</w:t>
             </w:r>
           </w:p>
           <w:p>
@@ -3146,7 +3092,7 @@
                 <w:i w:val="0"/>
                 <w:sz w:val="18"/>
               </w:rPr>
-              <w:t>NLS-ST (Cơ bản 1): GV ghi âm cả lớp hát kết hợp gõ đệm, mở lại qua loa; HS chỉ chỗ hát chưa đều</w:t>
+              <w:t>NLS-ST (Cơ bản 1): GV dùng điện thoại ghi âm cả lớp hát kết hợp gõ đệm theo phách rồi mở lại qua loa</w:t>
             </w:r>
           </w:p>
           <w:p>
@@ -3159,7 +3105,7 @@
                 <w:i w:val="0"/>
                 <w:sz w:val="18"/>
               </w:rPr>
-              <w:t>NLS-AT: Bản thu lấy từ học liệu bộ sách; nêu tên tác giả.</w:t>
+              <w:t>NLS-AT: Bản thu chỉ lấy từ học liệu của bộ sách hoặc kênh chính thức</w:t>
             </w:r>
           </w:p>
         </w:tc>
@@ -3300,7 +3246,7 @@
                 <w:i w:val="0"/>
                 <w:sz w:val="18"/>
               </w:rPr>
-              <w:t>NLS-KT (Cơ bản 1): GV chiếu hình 5 nốt kèm kí hiệu bàn tay, bấm phát cao độ; HS nhìn, nói tên nốt Pha, Son và làm kí hiệu</w:t>
+              <w:t>NLS-KT (Cơ bản 1): GV chiếu hình 5 nốt Đô – Rê – Mi – Pha – Son kèm kí hiệu bàn tay trên màn hình</w:t>
             </w:r>
           </w:p>
           <w:p>
@@ -3313,7 +3259,7 @@
                 <w:i w:val="0"/>
                 <w:sz w:val="18"/>
               </w:rPr>
-              <w:t>NLS-ST (Cơ bản 1): GV quay video lớp đọc nhạc kết hợp kí hiệu bàn tay, mở lại để HS tự sửa</w:t>
+              <w:t>NLS-ST (Cơ bản 1): GV quay đoạn video ngắn cả lớp đọc bài Những người bạn của Đô – Rê – Mi kết hợp kí hiệu bàn tay</w:t>
             </w:r>
           </w:p>
           <w:p>
@@ -3326,7 +3272,7 @@
                 <w:i w:val="0"/>
                 <w:sz w:val="18"/>
               </w:rPr>
-              <w:t>NLS-AT: Video chỉ xem tại lớp, không đăng mạng khi chưa được phép.</w:t>
+              <w:t>NLS-AT: Video của lớp chỉ dùng xem tại lớp</w:t>
             </w:r>
           </w:p>
         </w:tc>
@@ -3443,7 +3389,7 @@
                 <w:i w:val="0"/>
                 <w:sz w:val="18"/>
               </w:rPr>
-              <w:t>NLS-KT (Cơ bản 1): GV chiếu chân dung Mô-da, mở bản Khát vọng mùa xuân từ học liệu số, chiếu tên bản nhạc, nhạc sĩ; HS nghe, nói tên; NLS</w:t>
+              <w:t>NLS-KT (Cơ bản 1): GV chiếu chân dung Mô-da và tranh minh họa câu chuyện trên màn hình, mở bản Khát vọng mùa xuân từ học liệu số</w:t>
             </w:r>
           </w:p>
           <w:p>
@@ -3456,7 +3402,7 @@
                 <w:i w:val="0"/>
                 <w:sz w:val="18"/>
               </w:rPr>
-              <w:t>AI-NB (Cơ bản 1): GV cho AI đọc to đoạn kể về tuổi thơ Mô-da; HS nhận ra giọng máy</w:t>
+              <w:t>AI-NB (Cơ bản 1): GV dùng một ứng dụng AI đọc to đoạn ngắn kể về tuổi thơ Mô-da bằng giọng máy</w:t>
             </w:r>
           </w:p>
           <w:p>
@@ -3469,7 +3415,7 @@
                 <w:i w:val="0"/>
                 <w:sz w:val="18"/>
               </w:rPr>
-              <w:t>NLS-AT: Học liệu từ bộ sách, GV kiểm tra thông tin trước khi kể.</w:t>
+              <w:t>NLS-AT: Hình ảnh, bản nhạc lấy từ học liệu bộ sách hoặc kênh chính thức</w:t>
             </w:r>
           </w:p>
         </w:tc>
@@ -3586,7 +3532,7 @@
                 <w:i w:val="0"/>
                 <w:sz w:val="18"/>
               </w:rPr>
-              <w:t>NLS-KT (Cơ bản 1): GV mở các đoạn âm thanh dài – ngắn từ học liệu số kèm hình nét dài – ngắn; HS nghe, chỉ đúng hình</w:t>
+              <w:t>NLS-KT (Cơ bản 1): GV mở từ học liệu số các đoạn âm thanh dài – ngắn (tiếng còi tàu, tiếng chim hót, tiếng chuông)</w:t>
             </w:r>
           </w:p>
           <w:p>
@@ -3599,7 +3545,7 @@
                 <w:i w:val="0"/>
                 <w:sz w:val="18"/>
               </w:rPr>
-              <w:t>NLS-ST (Cơ bản 1): GV ghi âm trò chơi Ai hót dài hơn?, mở lại và chiếu vạch sóng âm; HS nói bạn nào ngân dài hơn</w:t>
+              <w:t>NLS-ST (Cơ bản 1): GV dùng điện thoại ghi âm phần “hót” của các bạn trong trò chơi Ai hót dài hơn?</w:t>
             </w:r>
           </w:p>
           <w:p>
@@ -3612,7 +3558,7 @@
                 <w:i w:val="0"/>
                 <w:sz w:val="18"/>
               </w:rPr>
-              <w:t>NLS-AT: Bản ghi chỉ dùng tại lớp, loa vừa đủ nghe.</w:t>
+              <w:t>NLS-AT: Âm thanh lấy từ học liệu bộ sách; bản ghi giọng HS chỉ dùng tại lớp</w:t>
             </w:r>
           </w:p>
           <w:p>
@@ -3742,7 +3688,7 @@
                 <w:i w:val="0"/>
                 <w:sz w:val="18"/>
               </w:rPr>
-              <w:t>NLS-KT (Cơ bản 1): GV mở bản hát mẫu “Gà gáy” từ học liệu số, chiếu tên bài, dân ca Cống Khao, lời mới Huy Trân; HS nghe từng câu rồi hát nối tiếp</w:t>
+              <w:t>NLS-KT (Cơ bản 1): GV mở bản hát mẫu bài “Gà gáy” từ học liệu số, chiếu màn hình có tên bài</w:t>
             </w:r>
           </w:p>
           <w:p>
@@ -3755,7 +3701,7 @@
                 <w:i w:val="0"/>
                 <w:sz w:val="18"/>
               </w:rPr>
-              <w:t>NLS-ST (Cơ bản 1): GV ghi âm lớp hát kết hợp gõ đệm, mở lại; HS chỉ chỗ ngân chưa đủ</w:t>
+              <w:t>NLS-ST (Cơ bản 1): GV dùng điện thoại ghi âm cả lớp hát kết hợp gõ đệm rồi mở lại qua loa; HS nghe và chỉ ra chỗ ngân chưa đủ</w:t>
             </w:r>
           </w:p>
           <w:p>
@@ -3768,7 +3714,7 @@
                 <w:i w:val="0"/>
                 <w:sz w:val="18"/>
               </w:rPr>
-              <w:t>NLS-AT: Bản thu từ học liệu bộ sách; nêu rõ nguồn dân ca.</w:t>
+              <w:t>NLS-AT: Bản thu chỉ lấy từ học liệu bộ sách hoặc kênh chính thức</w:t>
             </w:r>
           </w:p>
         </w:tc>
@@ -3885,7 +3831,7 @@
                 <w:i w:val="0"/>
                 <w:sz w:val="18"/>
               </w:rPr>
-              <w:t>NLS-KT (Cơ bản 1): GV chiếu tranh câu chuyện thanh phách, mở tiếng phách và đoạn dân ca có phách đệm; HS nói tên nhạc cụ, vật liệu tre; NLS</w:t>
+              <w:t>NLS-KT (Cơ bản 1): GV chiếu tranh minh họa câu chuyện về thanh phách và mở đoạn âm thanh tiếng phách gõ</w:t>
             </w:r>
           </w:p>
           <w:p>
@@ -3898,7 +3844,7 @@
                 <w:i w:val="0"/>
                 <w:sz w:val="18"/>
               </w:rPr>
-              <w:t>AI-NB (Cơ bản 1): GV cho AI vẽ hình thanh phách, HS so với thanh phách thật, nêu điểm giống – khác</w:t>
+              <w:t>AI-NB (Cơ bản 1): GV mở một ứng dụng AI tạo hình ảnh, nhập yêu cầu vẽ “hai thanh phách bằng tre”</w:t>
             </w:r>
           </w:p>
           <w:p>
@@ -3911,7 +3857,7 @@
                 <w:i w:val="0"/>
                 <w:sz w:val="18"/>
               </w:rPr>
-              <w:t>NLS-AT: Hình máy vẽ chỉ để so sánh, học liệu từ bộ sách.</w:t>
+              <w:t>NLS-AT: Hình do máy vẽ chỉ để so sánh, thanh phách thật mới là chuẩn; âm thanh</w:t>
             </w:r>
           </w:p>
         </w:tc>
@@ -4028,7 +3974,7 @@
                 <w:i w:val="0"/>
                 <w:sz w:val="18"/>
               </w:rPr>
-              <w:t>NLS-KT (Cơ bản 1): GV chiếu hình tiết tấu, phát tiếng phách mẫu; mở bài Lí cây bông từ học liệu số, chiếu tên bài, dân ca Nam Bộ; HS nghe, gõ theo</w:t>
+              <w:t>NLS-KT (Cơ bản 1): GV chiếu hình tiết tấu 1, 2 trên màn hình, bấm phát tiếng phách mẫu theo từng hình để HS nghe rồi gõ theo</w:t>
             </w:r>
           </w:p>
           <w:p>
@@ -4041,7 +3987,7 @@
                 <w:i w:val="0"/>
                 <w:sz w:val="18"/>
               </w:rPr>
-              <w:t>NLS-ST (Cơ bản 1): GV ghi âm lớp hát Gà gáy gõ thanh phách, mở lại; HS nhận xét tiếng phách</w:t>
+              <w:t>NLS-ST (Cơ bản 1): GV ghi âm cả lớp hát Gà gáy kết hợp gõ thanh phách rồi mở lại qua loa; HS nghe và nhận xét tiếng phách đã đều</w:t>
             </w:r>
           </w:p>
           <w:p>
@@ -4054,7 +4000,7 @@
                 <w:i w:val="0"/>
                 <w:sz w:val="18"/>
               </w:rPr>
-              <w:t>NLS-AT: Ngồi xa màn hình, loa vừa đủ, học liệu bộ sách.</w:t>
+              <w:t>NLS-AT: HS ngồi cách màn hình đủ xa, không nhìn quá lâu; loa mở vừa đủ nghe</w:t>
             </w:r>
           </w:p>
         </w:tc>
@@ -4171,7 +4117,7 @@
                 <w:i w:val="0"/>
                 <w:sz w:val="18"/>
               </w:rPr>
-              <w:t>NLS-KT (Cơ bản 1): GV mở tiếng gà gáy dài – ngắn từ học liệu số kèm hình nét dài – ngắn; HS nghe, chỉ đúng hình, gáy đáp</w:t>
+              <w:t>NLS-KT (Cơ bản 1): GV mở từ học liệu số các tiếng gà gáy dài – ngắn khác nhau kèm hình nét dài – nét ngắn trên màn hình</w:t>
             </w:r>
           </w:p>
           <w:p>
@@ -4184,7 +4130,7 @@
                 <w:i w:val="0"/>
                 <w:sz w:val="18"/>
               </w:rPr>
-              <w:t>NLS-GT (Cơ bản 1): GV ghi âm lớp gáy và chào buổi sáng làm lời nhắn gửi lớp bên qua Zalo của GV; HS nghe lại trước khi gửi</w:t>
+              <w:t>NLS-GT (Cơ bản 1): GV dùng điện thoại ghi âm cả lớp gáy “ò ó o” thật hay và nói lời chào buổi sáng</w:t>
             </w:r>
           </w:p>
           <w:p>
@@ -4197,7 +4143,7 @@
                 <w:i w:val="0"/>
                 <w:sz w:val="18"/>
               </w:rPr>
-              <w:t>NLS-AT: Không nêu tên riêng, GV là người gửi.</w:t>
+              <w:t>NLS-AT: Lời nhắn chỉ có giọng cả lớp, không nêu tên riêng, không kèm hình mặt HS</w:t>
             </w:r>
           </w:p>
           <w:p>
@@ -4327,7 +4273,7 @@
                 <w:i w:val="0"/>
                 <w:sz w:val="18"/>
               </w:rPr>
-              <w:t>NLS-KT (Cơ bản 1): GV mở bản hát mẫu “Cây gia đình” từ học liệu số, chiếu tên bài, tác giả nhạc và lời thơ; HS nghe từng câu rồi hát nối tiếp</w:t>
+              <w:t>NLS-KT (Cơ bản 1): GV mở bản hát mẫu bài “Cây gia đình” từ học liệu số, chiếu màn hình có tên bài</w:t>
             </w:r>
           </w:p>
           <w:p>
@@ -4340,7 +4286,7 @@
                 <w:i w:val="0"/>
                 <w:sz w:val="18"/>
               </w:rPr>
-              <w:t>NLS-ST (Cơ bản 1): GV ghi âm lớp hát kết hợp gõ đệm, mở lại; HS chỉ chỗ hát chưa rõ</w:t>
+              <w:t>NLS-ST (Cơ bản 1): GV dùng điện thoại ghi âm cả lớp hát bài Cây gia đình kết hợp gõ đệm, mở lại qua loa</w:t>
             </w:r>
           </w:p>
           <w:p>
@@ -4353,7 +4299,7 @@
                 <w:i w:val="0"/>
                 <w:sz w:val="18"/>
               </w:rPr>
-              <w:t>NLS-AT: Bản thu từ học liệu bộ sách; bản ghi lớp do GV gửi nhóm lớp.</w:t>
+              <w:t>NLS-AT: Bản thu chỉ lấy từ học liệu bộ sách hoặc kênh chính thức</w:t>
             </w:r>
           </w:p>
         </w:tc>
@@ -4470,7 +4416,7 @@
                 <w:i w:val="0"/>
                 <w:sz w:val="18"/>
               </w:rPr>
-              <w:t>NLS-KT (Cơ bản 1): GV mở bản đọc nhạc mẫu Hát cùng Đô – Rê – Mi – Pha – Son, chiếu bậc thang 5 nốt; HS nghe từng câu, nói tên nốt rồi đọc theo</w:t>
+              <w:t>NLS-KT (Cơ bản 1): GV mở bản đọc nhạc mẫu Hát cùng Đô – Rê – Mi – Pha – Son từ học liệu số</w:t>
             </w:r>
           </w:p>
           <w:p>
@@ -4483,7 +4429,7 @@
                 <w:i w:val="0"/>
                 <w:sz w:val="18"/>
               </w:rPr>
-              <w:t>NLS-ST (Cơ bản 1): GV quay lớp đọc nhạc kết hợp kí hiệu tay, mở lại; HS chỉ chỗ làm tay chưa đúng</w:t>
+              <w:t>NLS-ST (Cơ bản 1): GV dùng điện thoại quay đoạn ngắn cả lớp đọc nhạc kết hợp kí hiệu bàn tay, mở lại trên màn hình</w:t>
             </w:r>
           </w:p>
           <w:p>
@@ -4496,7 +4442,7 @@
                 <w:i w:val="0"/>
                 <w:sz w:val="18"/>
               </w:rPr>
-              <w:t>NLS-AT: Học liệu bộ sách; đoạn quay chỉ xem tại lớp.</w:t>
+              <w:t>NLS-AT: Bản đọc nhạc mẫu lấy từ học liệu của bộ sách, không tải từ trang lạ</w:t>
             </w:r>
           </w:p>
         </w:tc>
@@ -4613,7 +4559,7 @@
                 <w:i w:val="0"/>
                 <w:sz w:val="18"/>
               </w:rPr>
-              <w:t>NLS-KT (Cơ bản 1): GV mở bản thu Con chim vành khuyên, chiếu tranh, tên bài và nhạc sĩ Hoàng Vân; HS nghe, trả lời chú chim chào ai</w:t>
+              <w:t>NLS-KT (Cơ bản 1): GV mở bản thu Con chim vành khuyên từ học liệu số, chiếu tranh minh họa cùng tên bài, tên nhạc sĩ Hoàng Vân</w:t>
             </w:r>
           </w:p>
           <w:p>
@@ -4626,7 +4572,7 @@
                 <w:i w:val="0"/>
                 <w:sz w:val="18"/>
               </w:rPr>
-              <w:t>NLS-GT (Cơ bản 1): GV gửi bản thu lên nhóm lớp để HS nghe lại cùng cha mẹ</w:t>
+              <w:t>NLS-GT (Cơ bản 1): GV gửi bản thu bài hát lên nhóm lớp (Zalo) để cha mẹ mở cho HS nghe lại ở nhà và kể lại nội dung bài</w:t>
             </w:r>
           </w:p>
           <w:p>
@@ -4639,7 +4585,7 @@
                 <w:i w:val="0"/>
                 <w:sz w:val="18"/>
               </w:rPr>
-              <w:t>NLS-AT: Học liệu bộ sách; HS không tự dùng điện thoại, nghe cùng người lớn.</w:t>
+              <w:t>NLS-AT: Bản thu lấy từ học liệu bộ sách, không tải từ trang lạ</w:t>
             </w:r>
           </w:p>
         </w:tc>
@@ -4756,7 +4702,7 @@
                 <w:i w:val="0"/>
                 <w:sz w:val="18"/>
               </w:rPr>
-              <w:t>NLS-ST (Cơ bản 1): GV quay trò chơi Ban nhạc “Những người bạn”, mở lại; HS chỉ bạn đọc đúng nốt, chỗ cần sửa</w:t>
+              <w:t>NLS-ST (Cơ bản 1): GV dùng điện thoại quay đoạn ngắn trò chơi Ban nhạc “Những người bạn”, mở lại trên màn hình; HS xem lại</w:t>
             </w:r>
           </w:p>
           <w:p>
@@ -4769,7 +4715,7 @@
                 <w:i w:val="0"/>
                 <w:sz w:val="18"/>
               </w:rPr>
-              <w:t>NLS-KT (Cơ bản 1): GV mở bản thu Cây gia đình, Con chim vành khuyên; HS nghe đoạn đầu, nói tên bài</w:t>
+              <w:t>NLS-KT (Cơ bản 1): GV mở hai bản thu Cây gia đình và Con chim vành khuyên từ học liệu số, chiếu tranh minh họa từng bài; HS nghe đoạn đầu</w:t>
             </w:r>
           </w:p>
           <w:p>
@@ -4782,7 +4728,7 @@
                 <w:i w:val="0"/>
                 <w:sz w:val="18"/>
               </w:rPr>
-              <w:t>NLS-AT: Đoạn quay chỉ xem tại lớp; học liệu bộ sách.</w:t>
+              <w:t>NLS-AT: Đoạn quay chỉ để xem tại lớp, không đăng lên mạng khi chưa được cha mẹ đồng ý</w:t>
             </w:r>
           </w:p>
           <w:p>
@@ -4912,7 +4858,7 @@
                 <w:i w:val="0"/>
                 <w:sz w:val="18"/>
               </w:rPr>
-              <w:t>NLS-KT (Cơ bản 1): GV mở bản hát mẫu Ngôi sao lấp lánh, chiếu tên bài, người biên soạn lời Việt; HS nghe từng câu, hát nối tiếp</w:t>
+              <w:t>NLS-KT (Cơ bản 1): GV mở bản hát mẫu Ngôi sao lấp lánh từ học liệu số, chiếu tên bài cùng dòng “Nhạc nước ngoài</w:t>
             </w:r>
           </w:p>
           <w:p>
@@ -4925,7 +4871,7 @@
                 <w:i w:val="0"/>
                 <w:sz w:val="18"/>
               </w:rPr>
-              <w:t>NLS-ST (Cơ bản 1): GV ghi âm lớp hát, mở lại; HS chỉ chỗ hát chưa rõ</w:t>
+              <w:t>NLS-ST (Cơ bản 1): GV dùng điện thoại ghi âm lớp hát kết hợp vỗ tay theo phách, mở lại qua loa; HS nghe, chỉ ra chỗ hát chưa rõ lời</w:t>
             </w:r>
           </w:p>
           <w:p>
@@ -4938,7 +4884,7 @@
                 <w:i w:val="0"/>
                 <w:sz w:val="18"/>
               </w:rPr>
-              <w:t>NLS-AT: Bản thu từ học liệu bộ sách, nói rõ nguồn bài hát.</w:t>
+              <w:t>NLS-AT: Bản thu lấy từ học liệu bộ sách hoặc kênh chính thức</w:t>
             </w:r>
           </w:p>
         </w:tc>
@@ -5055,7 +5001,7 @@
                 <w:i w:val="0"/>
                 <w:sz w:val="18"/>
               </w:rPr>
-              <w:t>NLS-KT (Cơ bản 1): GV chiếu video/ảnh trai-en-gô từ học liệu số, mở âm mẫu; HS chỉ thân, dây treo, dùi và so tiếng gõ</w:t>
+              <w:t>NLS-KT (Cơ bản 1): GV chiếu ảnh hoặc đoạn video ngắn từ học liệu số về trai-en-gô trong dàn nhạc, mở âm thanh mẫu</w:t>
             </w:r>
           </w:p>
           <w:p>
@@ -5068,7 +5014,7 @@
                 <w:i w:val="0"/>
                 <w:sz w:val="18"/>
               </w:rPr>
-              <w:t>NLS-ST (Cơ bản 1): GV ghi âm nhóm gõ đệm, mở lại; HS nhận xét đều phách chưa</w:t>
+              <w:t>NLS-ST (Cơ bản 1): GV ghi âm nhóm gõ đệm trai-en-gô cho bài hát, mở lại qua loa; HS nghe, nói tiếng gõ đã đều phách chưa</w:t>
             </w:r>
           </w:p>
           <w:p>
@@ -5081,7 +5027,7 @@
                 <w:i w:val="0"/>
                 <w:sz w:val="18"/>
               </w:rPr>
-              <w:t>NLS-AT: Không gõ nhạc cụ lên thiết bị, không chạm dây điện.</w:t>
+              <w:t>NLS-AT: GV dặn HS không gõ dùi hay nhạc cụ lên máy tính, loa</w:t>
             </w:r>
           </w:p>
         </w:tc>
@@ -5198,33 +5144,6 @@
                 <w:i w:val="0"/>
                 <w:sz w:val="18"/>
               </w:rPr>
-              <w:t>NLS-KT (Cơ bản 1): GV mở âm mẫu trống con, thanh phách, trai-en-gô, chiếu bảng tiết tấu; HS nói tên nhạc cụ, gõ theo con trỏ</w:t>
-            </w:r>
-          </w:p>
-          <w:p>
-            <w:pPr>
-              <w:spacing w:after="0"/>
-            </w:pPr>
-            <w:r>
-              <w:rPr>
-                <w:b w:val="0"/>
-                <w:i w:val="0"/>
-                <w:sz w:val="18"/>
-              </w:rPr>
-              <w:t>NLS-ST (Cơ bản 1): GV quay “Dàn nhạc lớp 1”, mở lại; HS nhận xét nhóm gõ đều</w:t>
-            </w:r>
-          </w:p>
-          <w:p>
-            <w:pPr>
-              <w:spacing w:after="0"/>
-            </w:pPr>
-            <w:r>
-              <w:rPr>
-                <w:b w:val="0"/>
-                <w:i w:val="0"/>
-                <w:sz w:val="18"/>
-              </w:rPr>
-              <w:t>NLS-AT: Học liệu bộ sách; đoạn quay chỉ xem tại lớp.</w:t>
             </w:r>
           </w:p>
         </w:tc>
@@ -5341,33 +5260,6 @@
                 <w:i w:val="0"/>
                 <w:sz w:val="18"/>
               </w:rPr>
-              <w:t>NLS-KT (Cơ bản 1): GV chiếu tranh và nhạc dạo các bài hát từ học liệu số; HS nói tên bài, tác giả rồi đối chiếu màn hình</w:t>
-            </w:r>
-          </w:p>
-          <w:p>
-            <w:pPr>
-              <w:spacing w:after="0"/>
-            </w:pPr>
-            <w:r>
-              <w:rPr>
-                <w:b w:val="0"/>
-                <w:i w:val="0"/>
-                <w:sz w:val="18"/>
-              </w:rPr>
-              <w:t>NLS-GT (Cơ bản 1): GV gửi danh sách nhóm và nhạc đệm lên nhóm lớp để HS tập cùng cha mẹ</w:t>
-            </w:r>
-          </w:p>
-          <w:p>
-            <w:pPr>
-              <w:spacing w:after="0"/>
-            </w:pPr>
-            <w:r>
-              <w:rPr>
-                <w:b w:val="0"/>
-                <w:i w:val="0"/>
-                <w:sz w:val="18"/>
-              </w:rPr>
-              <w:t>NLS-AT: Học liệu bộ sách; HS không tự dùng điện thoại.</w:t>
             </w:r>
           </w:p>
         </w:tc>
@@ -5484,33 +5376,6 @@
                 <w:i w:val="0"/>
                 <w:sz w:val="18"/>
               </w:rPr>
-              <w:t>NLS-ST (Cơ bản 1): GV quay phần trình bày từng nhóm, mở lại; HS tự nhận xét một điều tốt, một điều cần sửa</w:t>
-            </w:r>
-          </w:p>
-          <w:p>
-            <w:pPr>
-              <w:spacing w:after="0"/>
-            </w:pPr>
-            <w:r>
-              <w:rPr>
-                <w:b w:val="0"/>
-                <w:i w:val="0"/>
-                <w:sz w:val="18"/>
-              </w:rPr>
-              <w:t>NLS-KT (Cơ bản 1): GV mở nhạc đệm, chiếu tên bài, tác giả để HS đọc khi giới thiệu</w:t>
-            </w:r>
-          </w:p>
-          <w:p>
-            <w:pPr>
-              <w:spacing w:after="0"/>
-            </w:pPr>
-            <w:r>
-              <w:rPr>
-                <w:b w:val="0"/>
-                <w:i w:val="0"/>
-                <w:sz w:val="18"/>
-              </w:rPr>
-              <w:t>NLS-AT: Đoạn quay chỉ xem tại lớp, lưu máy GV; học liệu bộ sách.</w:t>
             </w:r>
           </w:p>
         </w:tc>
@@ -5627,33 +5492,6 @@
                 <w:i w:val="0"/>
                 <w:sz w:val="18"/>
               </w:rPr>
-              <w:t>NLS-ST (Cơ bản 1): GV quay, ghép các phần trình bày thành video buổi biểu diễn cuối năm, mở lại; HS nói mình trình bày bài gì</w:t>
-            </w:r>
-          </w:p>
-          <w:p>
-            <w:pPr>
-              <w:spacing w:after="0"/>
-            </w:pPr>
-            <w:r>
-              <w:rPr>
-                <w:b w:val="0"/>
-                <w:i w:val="0"/>
-                <w:sz w:val="18"/>
-              </w:rPr>
-              <w:t>NLS-GT (Cơ bản 1): GV gửi video lên nhóm lớp để HS xem cùng cha mẹ</w:t>
-            </w:r>
-          </w:p>
-          <w:p>
-            <w:pPr>
-              <w:spacing w:after="0"/>
-            </w:pPr>
-            <w:r>
-              <w:rPr>
-                <w:b w:val="0"/>
-                <w:i w:val="0"/>
-                <w:sz w:val="18"/>
-              </w:rPr>
-              <w:t>NLS-AT: Video lưu máy GV, chia sẻ khi cha mẹ đồng ý; HS không tự dùng điện thoại.</w:t>
             </w:r>
           </w:p>
         </w:tc>

</xml_diff>

<commit_message>
Hai website theo giáo án đã đủ Năng lực số cả năm, có thêm ATGT và Quyền trẻ em (bản 148)
Co-Authored-By: Claude Opus 5 <noreply@anthropic.com>
Claude-Session: https://claude.ai/code/session_012QM1GXaYjbK1XCf3MjTDap
</commit_message>
<xml_diff>
--- a/assets/docs/lop1/Am nhac - Lop 1.docx
+++ b/assets/docs/lop1/Am nhac - Lop 1.docx
@@ -624,33 +624,7 @@
                 <w:i w:val="0"/>
                 <w:sz w:val="18"/>
               </w:rPr>
-              <w:t>NLS-KT (Cơ bản 1): GV mở bản hát mẫu bài “Vào rừng hoa” từ học liệu số của bộ sách</w:t>
-            </w:r>
-          </w:p>
-          <w:p>
-            <w:pPr>
-              <w:spacing w:after="0"/>
-            </w:pPr>
-            <w:r>
-              <w:rPr>
-                <w:b w:val="0"/>
-                <w:i w:val="0"/>
-                <w:sz w:val="18"/>
-              </w:rPr>
-              <w:t>NLS-ST (Cơ bản 1): GV dùng điện thoại ghi âm phần cả lớp hát kết hợp vỗ tay theo phách rồi mở lại qua loa ngay tại lớp</w:t>
-            </w:r>
-          </w:p>
-          <w:p>
-            <w:pPr>
-              <w:spacing w:after="0"/>
-            </w:pPr>
-            <w:r>
-              <w:rPr>
-                <w:b w:val="0"/>
-                <w:i w:val="0"/>
-                <w:sz w:val="18"/>
-              </w:rPr>
-              <w:t>NLS-AT: Bản thu chỉ lấy từ học liệu của bộ sách hoặc kênh chính thức</w:t>
+              <w:t>NLS-KT (Cơ bản 1): Mở bản hát mẫu bài “Vào rừng hoa” từ học liệu số của bộ sách, chiếu màn hình.</w:t>
             </w:r>
           </w:p>
         </w:tc>
@@ -767,33 +741,7 @@
                 <w:i w:val="0"/>
                 <w:sz w:val="18"/>
               </w:rPr>
-              <w:t>NLS-KT (Cơ bản 1): GV mở lần lượt các đoạn âm thanh tự nhiên (chim hót, gió, mưa, suối chảy) và âm thanh nhạc cụ (trống, đàn) từ học liệu số</w:t>
-            </w:r>
-          </w:p>
-          <w:p>
-            <w:pPr>
-              <w:spacing w:after="0"/>
-            </w:pPr>
-            <w:r>
-              <w:rPr>
-                <w:b w:val="0"/>
-                <w:i w:val="0"/>
-                <w:sz w:val="18"/>
-              </w:rPr>
-              <w:t>NLS-ST (Cơ bản 1): GV ghi âm phần cả lớp tạo "cơn mưa rừng" bằng tay chân, mở lại qua loa; HS nghe và nhận xét đoạn nào nghe giống mưa nhỏ</w:t>
-            </w:r>
-          </w:p>
-          <w:p>
-            <w:pPr>
-              <w:spacing w:after="0"/>
-            </w:pPr>
-            <w:r>
-              <w:rPr>
-                <w:b w:val="0"/>
-                <w:i w:val="0"/>
-                <w:sz w:val="18"/>
-              </w:rPr>
-              <w:t>NLS-AT: Các tệp âm thanh lấy từ học liệu của bộ sách hoặc kho âm thanh miễn phí có</w:t>
+              <w:t>NLS-ST (Cơ bản 1): Ghi âm phần cả lớp tạo "cơn mưa rừng" bằng tay chân, mở lại qua loa.</w:t>
             </w:r>
           </w:p>
         </w:tc>
@@ -910,33 +858,7 @@
                 <w:i w:val="0"/>
                 <w:sz w:val="18"/>
               </w:rPr>
-              <w:t>NLS-KT (Cơ bản 1): GV chiếu hình bậc thang Đô – Rê – Mi từ học liệu số</w:t>
-            </w:r>
-          </w:p>
-          <w:p>
-            <w:pPr>
-              <w:spacing w:after="0"/>
-            </w:pPr>
-            <w:r>
-              <w:rPr>
-                <w:b w:val="0"/>
-                <w:i w:val="0"/>
-                <w:sz w:val="18"/>
-              </w:rPr>
-              <w:t>NLS-ST (Cơ bản 1): GV quay đoạn ngắn cả lớp đọc Đô – Rê – Mi kết hợp kí hiệu bàn tay</w:t>
-            </w:r>
-          </w:p>
-          <w:p>
-            <w:pPr>
-              <w:spacing w:after="0"/>
-            </w:pPr>
-            <w:r>
-              <w:rPr>
-                <w:b w:val="0"/>
-                <w:i w:val="0"/>
-                <w:sz w:val="18"/>
-              </w:rPr>
-              <w:t>NLS-AT: Hình ảnh và âm thanh lấy từ học liệu của bộ sách; đoạn quay chỉ dùng tại lớp</w:t>
+              <w:t>NLS-KT (Cơ bản 1): Chiếu hình bậc thang Đô – Rê.</w:t>
             </w:r>
           </w:p>
         </w:tc>
@@ -1053,33 +975,7 @@
                 <w:i w:val="0"/>
                 <w:sz w:val="18"/>
               </w:rPr>
-              <w:t>NLS-ST (Cơ bản 1): GV dùng điện thoại ghi âm phần cả lớp đọc Đô – Rê – Mi lần to, lần nhỏ rồi mở lại qua loa</w:t>
-            </w:r>
-          </w:p>
-          <w:p>
-            <w:pPr>
-              <w:spacing w:after="0"/>
-            </w:pPr>
-            <w:r>
-              <w:rPr>
-                <w:b w:val="0"/>
-                <w:i w:val="0"/>
-                <w:sz w:val="18"/>
-              </w:rPr>
-              <w:t>NLS-KT (Cơ bản 1): GV mở một đoạn nhạc ngắn từ học liệu số có chỗ to, chỗ nhỏ, chiếu hình "loa to" – "loa nhỏ" thay đổi theo nhạc</w:t>
-            </w:r>
-          </w:p>
-          <w:p>
-            <w:pPr>
-              <w:spacing w:after="0"/>
-            </w:pPr>
-            <w:r>
-              <w:rPr>
-                <w:b w:val="0"/>
-                <w:i w:val="0"/>
-                <w:sz w:val="18"/>
-              </w:rPr>
-              <w:t>NLS-AT: GV chỉnh âm lượng loa vừa phải, không tăng quá to khi minh họa "to"</w:t>
+              <w:t>NLS-ST (Cơ bản 1): Dùng điện thoại ghi âm phần cả lớp đọc Đô.</w:t>
             </w:r>
           </w:p>
           <w:p>
@@ -1209,33 +1105,7 @@
                 <w:i w:val="0"/>
                 <w:sz w:val="18"/>
               </w:rPr>
-              <w:t>NLS-KT (Cơ bản 1): GV mở bản hát mẫu bài “Tổ quốc ta” từ học liệu số của bộ sách</w:t>
-            </w:r>
-          </w:p>
-          <w:p>
-            <w:pPr>
-              <w:spacing w:after="0"/>
-            </w:pPr>
-            <w:r>
-              <w:rPr>
-                <w:b w:val="0"/>
-                <w:i w:val="0"/>
-                <w:sz w:val="18"/>
-              </w:rPr>
-              <w:t>NLS-ST (Cơ bản 1): GV dùng điện thoại ghi âm phần cả lớp hát kết hợp gõ phách rồi mở lại qua loa ngay tại lớp</w:t>
-            </w:r>
-          </w:p>
-          <w:p>
-            <w:pPr>
-              <w:spacing w:after="0"/>
-            </w:pPr>
-            <w:r>
-              <w:rPr>
-                <w:b w:val="0"/>
-                <w:i w:val="0"/>
-                <w:sz w:val="18"/>
-              </w:rPr>
-              <w:t>NLS-AT: Bản thu chỉ lấy từ học liệu của bộ sách hoặc kênh chính thức</w:t>
+              <w:t>NLS-KT (Cơ bản 1): Mở bản hát mẫu bài “Tổ quốc ta” từ học liệu số của bộ sách.</w:t>
             </w:r>
           </w:p>
           <w:p>
@@ -1365,33 +1235,7 @@
                 <w:i w:val="0"/>
                 <w:sz w:val="18"/>
               </w:rPr>
-              <w:t>NLS-KT (Cơ bản 1): GV mở đoạn phim ngắn từ học liệu số về đội trống của thiếu nhi (đeo trống, cầm dùi, gõ đều)</w:t>
-            </w:r>
-          </w:p>
-          <w:p>
-            <w:pPr>
-              <w:spacing w:after="0"/>
-            </w:pPr>
-            <w:r>
-              <w:rPr>
-                <w:b w:val="0"/>
-                <w:i w:val="0"/>
-                <w:sz w:val="18"/>
-              </w:rPr>
-              <w:t>NLS-ST (Cơ bản 1): GV ghi âm phần nhóm gõ trống con theo hình tiết tấu và mở lại qua loa; HS nghe xem tiếng gõ đã đều chưa</w:t>
-            </w:r>
-          </w:p>
-          <w:p>
-            <w:pPr>
-              <w:spacing w:after="0"/>
-            </w:pPr>
-            <w:r>
-              <w:rPr>
-                <w:b w:val="0"/>
-                <w:i w:val="0"/>
-                <w:sz w:val="18"/>
-              </w:rPr>
-              <w:t>NLS-AT: Đoạn phim lấy từ học liệu của bộ sách hoặc kênh chính thức, GV xem trước</w:t>
+              <w:t>NLS-ST (Cơ bản 1): Ghi âm phần nhóm gõ trống con theo hình tiết tấu.</w:t>
             </w:r>
           </w:p>
           <w:p>
@@ -1521,33 +1365,7 @@
                 <w:i w:val="0"/>
                 <w:sz w:val="18"/>
               </w:rPr>
-              <w:t>NLS-KT (Cơ bản 1): GV mở bản thu Quốc ca từ học liệu chính thức, chiếu hình lá cờ Tổ quốc và tên nhạc sĩ Văn Cao</w:t>
-            </w:r>
-          </w:p>
-          <w:p>
-            <w:pPr>
-              <w:spacing w:after="0"/>
-            </w:pPr>
-            <w:r>
-              <w:rPr>
-                <w:b w:val="0"/>
-                <w:i w:val="0"/>
-                <w:sz w:val="18"/>
-              </w:rPr>
-              <w:t>NLS-ST (Cơ bản 1): GV ghi âm phần nhóm hát Tổ quốc ta có gõ trống con đệm theo phách, mở lại qua loa</w:t>
-            </w:r>
-          </w:p>
-          <w:p>
-            <w:pPr>
-              <w:spacing w:after="0"/>
-            </w:pPr>
-            <w:r>
-              <w:rPr>
-                <w:b w:val="0"/>
-                <w:i w:val="0"/>
-                <w:sz w:val="18"/>
-              </w:rPr>
-              <w:t>NLS-AT: Bản Quốc ca phải lấy từ nguồn chính thức, không dùng bản phối lạ</w:t>
+              <w:t>NLS-KT (Cơ bản 1): Mở bản thu Quốc ca từ học liệu chính thức, chiếu hình lá cờ Tổ quốc.</w:t>
             </w:r>
           </w:p>
           <w:p>
@@ -1677,33 +1495,7 @@
                 <w:i w:val="0"/>
                 <w:sz w:val="18"/>
               </w:rPr>
-              <w:t>NLS-KT (Cơ bản 1): GV mở từ học liệu số các đoạn âm thanh cao – thấp (tiếng chim, tiếng bò, tiếng sáo, tiếng trống) và tiếng đàn các nốt</w:t>
-            </w:r>
-          </w:p>
-          <w:p>
-            <w:pPr>
-              <w:spacing w:after="0"/>
-            </w:pPr>
-            <w:r>
-              <w:rPr>
-                <w:b w:val="0"/>
-                <w:i w:val="0"/>
-                <w:sz w:val="18"/>
-              </w:rPr>
-              <w:t>NLS-ST (Cơ bản 1): GV ghi âm phần cả lớp hát "la" nhắc lại mẫu cao – thấp và mở lại qua loa</w:t>
-            </w:r>
-          </w:p>
-          <w:p>
-            <w:pPr>
-              <w:spacing w:after="0"/>
-            </w:pPr>
-            <w:r>
-              <w:rPr>
-                <w:b w:val="0"/>
-                <w:i w:val="0"/>
-                <w:sz w:val="18"/>
-              </w:rPr>
-              <w:t>NLS-AT: Âm thanh lấy từ học liệu của bộ sách hoặc kho âm thanh có ghi rõ nguồn</w:t>
+              <w:t>NLS-ST (Cơ bản 1): Ghi âm phần cả lớp hát "la" nhắc lại mẫu cao.</w:t>
             </w:r>
           </w:p>
           <w:p>
@@ -1833,33 +1625,7 @@
                 <w:i w:val="0"/>
                 <w:sz w:val="18"/>
               </w:rPr>
-              <w:t>NLS-KT (Cơ bản 1): GV mở bản hát mẫu bài “Lớp Một thân yêu” từ học liệu số của bộ sách</w:t>
-            </w:r>
-          </w:p>
-          <w:p>
-            <w:pPr>
-              <w:spacing w:after="0"/>
-            </w:pPr>
-            <w:r>
-              <w:rPr>
-                <w:b w:val="0"/>
-                <w:i w:val="0"/>
-                <w:sz w:val="18"/>
-              </w:rPr>
-              <w:t>NLS-ST (Cơ bản 1): GV dùng điện thoại ghi âm phần cả lớp hát kết hợp vỗ tay theo phách rồi mở lại qua loa ngay tại lớp</w:t>
-            </w:r>
-          </w:p>
-          <w:p>
-            <w:pPr>
-              <w:spacing w:after="0"/>
-            </w:pPr>
-            <w:r>
-              <w:rPr>
-                <w:b w:val="0"/>
-                <w:i w:val="0"/>
-                <w:sz w:val="18"/>
-              </w:rPr>
-              <w:t>NLS-AT: Bản thu chỉ lấy từ học liệu của bộ sách hoặc kênh chính thức</w:t>
+              <w:t>NLS-KT (Cơ bản 1): Mở bản hát mẫu bài “Lớp Một thân yêu” từ học liệu số của bộ sách.</w:t>
             </w:r>
           </w:p>
         </w:tc>
@@ -1976,33 +1742,7 @@
                 <w:i w:val="0"/>
                 <w:sz w:val="18"/>
               </w:rPr>
-              <w:t>NLS-KT (Cơ bản 1): GV chiếu hình ba kí hiệu bàn tay Đô – Rê – Mi lấy từ học liệu số của bộ sách</w:t>
-            </w:r>
-          </w:p>
-          <w:p>
-            <w:pPr>
-              <w:spacing w:after="0"/>
-            </w:pPr>
-            <w:r>
-              <w:rPr>
-                <w:b w:val="0"/>
-                <w:i w:val="0"/>
-                <w:sz w:val="18"/>
-              </w:rPr>
-              <w:t>NLS-ST (Cơ bản 1): GV dùng điện thoại quay ngắn phần “ban nhạc Đô – Rê – Mi” của một nhóm rồi mở lại trên màn hình</w:t>
-            </w:r>
-          </w:p>
-          <w:p>
-            <w:pPr>
-              <w:spacing w:after="0"/>
-            </w:pPr>
-            <w:r>
-              <w:rPr>
-                <w:b w:val="0"/>
-                <w:i w:val="0"/>
-                <w:sz w:val="18"/>
-              </w:rPr>
-              <w:t>NLS-AT: Âm mẫu và hình kí hiệu bàn tay lấy từ học liệu của bộ sách</w:t>
+              <w:t>NLS-ST (Cơ bản 1): Dùng điện thoại quay ngắn phần “ban nhạc Đô – Rê – Mi” của một nhóm.</w:t>
             </w:r>
           </w:p>
         </w:tc>
@@ -2119,33 +1859,7 @@
                 <w:i w:val="0"/>
                 <w:sz w:val="18"/>
               </w:rPr>
-              <w:t>NLS-KT (Cơ bản 1): GV mở bản thu bài “Những bông hoa những bài ca” từ học liệu số</w:t>
-            </w:r>
-          </w:p>
-          <w:p>
-            <w:pPr>
-              <w:spacing w:after="0"/>
-            </w:pPr>
-            <w:r>
-              <w:rPr>
-                <w:b w:val="0"/>
-                <w:i w:val="0"/>
-                <w:sz w:val="18"/>
-              </w:rPr>
-              <w:t>AI-NB (Cơ bản 1): GV dùng phần mềm đàn phím trên máy tính bật từng nốt Đô, Rê, Mi để HS đọc lại</w:t>
-            </w:r>
-          </w:p>
-          <w:p>
-            <w:pPr>
-              <w:spacing w:after="0"/>
-            </w:pPr>
-            <w:r>
-              <w:rPr>
-                <w:b w:val="0"/>
-                <w:i w:val="0"/>
-                <w:sz w:val="18"/>
-              </w:rPr>
-              <w:t>NLS-AT: Bản thu lấy từ học liệu của bộ sách hoặc kênh chính thức, nêu rõ tên tác giả</w:t>
+              <w:t>NLS-KT (Cơ bản 1): Mở bản thu bài “Những bông hoa những bài ca” từ học liệu số, chiếu màn hình.</w:t>
             </w:r>
           </w:p>
         </w:tc>
@@ -2262,33 +1976,7 @@
                 <w:i w:val="0"/>
                 <w:sz w:val="18"/>
               </w:rPr>
-              <w:t>NLS-KT (Cơ bản 1): GV mở ứng dụng ghi âm có hình sóng âm trên màn hình, cho cả lớp đọc “la” to rồi nhỏ</w:t>
-            </w:r>
-          </w:p>
-          <w:p>
-            <w:pPr>
-              <w:spacing w:after="0"/>
-            </w:pPr>
-            <w:r>
-              <w:rPr>
-                <w:b w:val="0"/>
-                <w:i w:val="0"/>
-                <w:sz w:val="18"/>
-              </w:rPr>
-              <w:t>NLS-ST (Cơ bản 1): GV ghi âm một nhóm đọc câu nhạc Đô – Rê – Mi to – nhỏ theo hình, mở lại qua loa</w:t>
-            </w:r>
-          </w:p>
-          <w:p>
-            <w:pPr>
-              <w:spacing w:after="0"/>
-            </w:pPr>
-            <w:r>
-              <w:rPr>
-                <w:b w:val="0"/>
-                <w:i w:val="0"/>
-                <w:sz w:val="18"/>
-              </w:rPr>
-              <w:t>NLS-AT: Không để HS hét quá to vào micro; loa mở vừa đủ nghe, không để sát tai</w:t>
+              <w:t>NLS-ST (Cơ bản 1): Ghi âm một nhóm đọc câu nhạc Đô.</w:t>
             </w:r>
           </w:p>
           <w:p>
@@ -2418,33 +2106,7 @@
                 <w:i w:val="0"/>
                 <w:sz w:val="18"/>
               </w:rPr>
-              <w:t>NLS-KT (Cơ bản 1): GV mở bản hát mẫu bài “Chào người bạn mới đến” từ học liệu số, chiếu màn hình có tên bài và tên tác giả Lương Bằng Vinh</w:t>
-            </w:r>
-          </w:p>
-          <w:p>
-            <w:pPr>
-              <w:spacing w:after="0"/>
-            </w:pPr>
-            <w:r>
-              <w:rPr>
-                <w:b w:val="0"/>
-                <w:i w:val="0"/>
-                <w:sz w:val="18"/>
-              </w:rPr>
-              <w:t>NLS-GT (Cơ bản 1): GV dùng điện thoại quay đoạn cả lớp hát kết hợp động tác chào bạn, mở lại trên màn hình để HS xem</w:t>
-            </w:r>
-          </w:p>
-          <w:p>
-            <w:pPr>
-              <w:spacing w:after="0"/>
-            </w:pPr>
-            <w:r>
-              <w:rPr>
-                <w:b w:val="0"/>
-                <w:i w:val="0"/>
-                <w:sz w:val="18"/>
-              </w:rPr>
-              <w:t>NLS-AT: Bản hát mẫu lấy từ học liệu của bộ sách hoặc kênh chính thức</w:t>
+              <w:t>NLS-KT (Cơ bản 1): Mở bản hát mẫu bài “Chào người bạn mới đến” từ học liệu số, chiếu màn hình.</w:t>
             </w:r>
           </w:p>
         </w:tc>
@@ -2561,33 +2223,7 @@
                 <w:i w:val="0"/>
                 <w:sz w:val="18"/>
               </w:rPr>
-              <w:t>NLS-KT (Cơ bản 1): GV mở video ngắn từ học liệu số giới thiệu cách cầm và gõ trống con</w:t>
-            </w:r>
-          </w:p>
-          <w:p>
-            <w:pPr>
-              <w:spacing w:after="0"/>
-            </w:pPr>
-            <w:r>
-              <w:rPr>
-                <w:b w:val="0"/>
-                <w:i w:val="0"/>
-                <w:sz w:val="18"/>
-              </w:rPr>
-              <w:t>NLS-ST (Cơ bản 1): GV dùng điện thoại ghi âm phần cả lớp hát kết hợp gõ trống đệm theo phách, mở lại qua loa</w:t>
-            </w:r>
-          </w:p>
-          <w:p>
-            <w:pPr>
-              <w:spacing w:after="0"/>
-            </w:pPr>
-            <w:r>
-              <w:rPr>
-                <w:b w:val="0"/>
-                <w:i w:val="0"/>
-                <w:sz w:val="18"/>
-              </w:rPr>
-              <w:t>NLS-AT: Video và âm thanh mẫu lấy từ học liệu của bộ sách; loa mở vừa đủ nghe</w:t>
+              <w:t>NLS-ST (Cơ bản 1): Dùng điện thoại ghi âm phần cả lớp hát kết hợp gõ trống đệm theo phách, mở lại qua loa.</w:t>
             </w:r>
           </w:p>
         </w:tc>
@@ -2704,33 +2340,7 @@
                 <w:i w:val="0"/>
                 <w:sz w:val="18"/>
               </w:rPr>
-              <w:t>NLS-KT (Cơ bản 1): GV chiếu hình và video ngắn trống cái ở trường học, lễ hội lấy từ học liệu số</w:t>
-            </w:r>
-          </w:p>
-          <w:p>
-            <w:pPr>
-              <w:spacing w:after="0"/>
-            </w:pPr>
-            <w:r>
-              <w:rPr>
-                <w:b w:val="0"/>
-                <w:i w:val="0"/>
-                <w:sz w:val="18"/>
-              </w:rPr>
-              <w:t>AI-NB (Cơ bản 1): GV chuẩn bị trước một đoạn giới thiệu ngắn 2–3 câu về đàn thiên nga trong vở ba lê Hồ thiên nga do trợ lí AI đọc bằng</w:t>
-            </w:r>
-          </w:p>
-          <w:p>
-            <w:pPr>
-              <w:spacing w:after="0"/>
-            </w:pPr>
-            <w:r>
-              <w:rPr>
-                <w:b w:val="0"/>
-                <w:i w:val="0"/>
-                <w:sz w:val="18"/>
-              </w:rPr>
-              <w:t>NLS-AT: Hình, video, bản thu lấy từ học liệu của bộ sách hoặc kênh chính thức</w:t>
+              <w:t>NLS-KT (Cơ bản 1): Chiếu hình và video ngắn trống cái ở trường học, lễ hội lấy từ học liệu số, bật lần lượt tiếng trống.</w:t>
             </w:r>
           </w:p>
         </w:tc>
@@ -3079,33 +2689,7 @@
                 <w:i w:val="0"/>
                 <w:sz w:val="18"/>
               </w:rPr>
-              <w:t>NLS-KT (Cơ bản 1): GV mở bản hát mẫu bài “Xúc xắc xúc xẻ” từ học liệu số, chiếu màn hình có tên bài</w:t>
-            </w:r>
-          </w:p>
-          <w:p>
-            <w:pPr>
-              <w:spacing w:after="0"/>
-            </w:pPr>
-            <w:r>
-              <w:rPr>
-                <w:b w:val="0"/>
-                <w:i w:val="0"/>
-                <w:sz w:val="18"/>
-              </w:rPr>
-              <w:t>NLS-ST (Cơ bản 1): GV dùng điện thoại ghi âm cả lớp hát kết hợp gõ đệm theo phách rồi mở lại qua loa</w:t>
-            </w:r>
-          </w:p>
-          <w:p>
-            <w:pPr>
-              <w:spacing w:after="0"/>
-            </w:pPr>
-            <w:r>
-              <w:rPr>
-                <w:b w:val="0"/>
-                <w:i w:val="0"/>
-                <w:sz w:val="18"/>
-              </w:rPr>
-              <w:t>NLS-AT: Bản thu chỉ lấy từ học liệu của bộ sách hoặc kênh chính thức</w:t>
+              <w:t>NLS-ST (Cơ bản 1): Dùng điện thoại ghi âm cả lớp hát kết hợp gõ đệm theo phách.</w:t>
             </w:r>
           </w:p>
         </w:tc>
@@ -3246,33 +2830,7 @@
                 <w:i w:val="0"/>
                 <w:sz w:val="18"/>
               </w:rPr>
-              <w:t>NLS-KT (Cơ bản 1): GV chiếu hình 5 nốt Đô – Rê – Mi – Pha – Son kèm kí hiệu bàn tay trên màn hình</w:t>
-            </w:r>
-          </w:p>
-          <w:p>
-            <w:pPr>
-              <w:spacing w:after="0"/>
-            </w:pPr>
-            <w:r>
-              <w:rPr>
-                <w:b w:val="0"/>
-                <w:i w:val="0"/>
-                <w:sz w:val="18"/>
-              </w:rPr>
-              <w:t>NLS-ST (Cơ bản 1): GV quay đoạn video ngắn cả lớp đọc bài Những người bạn của Đô – Rê – Mi kết hợp kí hiệu bàn tay</w:t>
-            </w:r>
-          </w:p>
-          <w:p>
-            <w:pPr>
-              <w:spacing w:after="0"/>
-            </w:pPr>
-            <w:r>
-              <w:rPr>
-                <w:b w:val="0"/>
-                <w:i w:val="0"/>
-                <w:sz w:val="18"/>
-              </w:rPr>
-              <w:t>NLS-AT: Video của lớp chỉ dùng xem tại lớp</w:t>
+              <w:t>NLS-KT (Cơ bản 1): Chiếu hình 5 nốt Đô – Rê.</w:t>
             </w:r>
           </w:p>
         </w:tc>
@@ -3389,33 +2947,7 @@
                 <w:i w:val="0"/>
                 <w:sz w:val="18"/>
               </w:rPr>
-              <w:t>NLS-KT (Cơ bản 1): GV chiếu chân dung Mô-da và tranh minh họa câu chuyện trên màn hình, mở bản Khát vọng mùa xuân từ học liệu số</w:t>
-            </w:r>
-          </w:p>
-          <w:p>
-            <w:pPr>
-              <w:spacing w:after="0"/>
-            </w:pPr>
-            <w:r>
-              <w:rPr>
-                <w:b w:val="0"/>
-                <w:i w:val="0"/>
-                <w:sz w:val="18"/>
-              </w:rPr>
-              <w:t>AI-NB (Cơ bản 1): GV dùng một ứng dụng AI đọc to đoạn ngắn kể về tuổi thơ Mô-da bằng giọng máy</w:t>
-            </w:r>
-          </w:p>
-          <w:p>
-            <w:pPr>
-              <w:spacing w:after="0"/>
-            </w:pPr>
-            <w:r>
-              <w:rPr>
-                <w:b w:val="0"/>
-                <w:i w:val="0"/>
-                <w:sz w:val="18"/>
-              </w:rPr>
-              <w:t>NLS-AT: Hình ảnh, bản nhạc lấy từ học liệu bộ sách hoặc kênh chính thức</w:t>
+              <w:t>AI-NB (Nhận biết): Dùng một ứng dụng AI đọc to đoạn ngắn kể về tuổi thơ Mô-da bằng giọng máy, hỏi.</w:t>
             </w:r>
           </w:p>
         </w:tc>
@@ -3532,33 +3064,7 @@
                 <w:i w:val="0"/>
                 <w:sz w:val="18"/>
               </w:rPr>
-              <w:t>NLS-KT (Cơ bản 1): GV mở từ học liệu số các đoạn âm thanh dài – ngắn (tiếng còi tàu, tiếng chim hót, tiếng chuông)</w:t>
-            </w:r>
-          </w:p>
-          <w:p>
-            <w:pPr>
-              <w:spacing w:after="0"/>
-            </w:pPr>
-            <w:r>
-              <w:rPr>
-                <w:b w:val="0"/>
-                <w:i w:val="0"/>
-                <w:sz w:val="18"/>
-              </w:rPr>
-              <w:t>NLS-ST (Cơ bản 1): GV dùng điện thoại ghi âm phần “hót” của các bạn trong trò chơi Ai hót dài hơn?</w:t>
-            </w:r>
-          </w:p>
-          <w:p>
-            <w:pPr>
-              <w:spacing w:after="0"/>
-            </w:pPr>
-            <w:r>
-              <w:rPr>
-                <w:b w:val="0"/>
-                <w:i w:val="0"/>
-                <w:sz w:val="18"/>
-              </w:rPr>
-              <w:t>NLS-AT: Âm thanh lấy từ học liệu bộ sách; bản ghi giọng HS chỉ dùng tại lớp</w:t>
+              <w:t>NLS-KT (Cơ bản 1): Mở từ học liệu số các đoạn âm thanh dài – ngắn (tiếng còi tàu, tiếng chim hót, tiếng chuông), chiếu.</w:t>
             </w:r>
           </w:p>
           <w:p>
@@ -3688,33 +3194,7 @@
                 <w:i w:val="0"/>
                 <w:sz w:val="18"/>
               </w:rPr>
-              <w:t>NLS-KT (Cơ bản 1): GV mở bản hát mẫu bài “Gà gáy” từ học liệu số, chiếu màn hình có tên bài</w:t>
-            </w:r>
-          </w:p>
-          <w:p>
-            <w:pPr>
-              <w:spacing w:after="0"/>
-            </w:pPr>
-            <w:r>
-              <w:rPr>
-                <w:b w:val="0"/>
-                <w:i w:val="0"/>
-                <w:sz w:val="18"/>
-              </w:rPr>
-              <w:t>NLS-ST (Cơ bản 1): GV dùng điện thoại ghi âm cả lớp hát kết hợp gõ đệm rồi mở lại qua loa; HS nghe và chỉ ra chỗ ngân chưa đủ</w:t>
-            </w:r>
-          </w:p>
-          <w:p>
-            <w:pPr>
-              <w:spacing w:after="0"/>
-            </w:pPr>
-            <w:r>
-              <w:rPr>
-                <w:b w:val="0"/>
-                <w:i w:val="0"/>
-                <w:sz w:val="18"/>
-              </w:rPr>
-              <w:t>NLS-AT: Bản thu chỉ lấy từ học liệu bộ sách hoặc kênh chính thức</w:t>
+              <w:t>NLS-ST (Cơ bản 1): Dùng điện thoại ghi âm cả lớp hát kết hợp gõ đệm.</w:t>
             </w:r>
           </w:p>
         </w:tc>
@@ -3831,33 +3311,7 @@
                 <w:i w:val="0"/>
                 <w:sz w:val="18"/>
               </w:rPr>
-              <w:t>NLS-KT (Cơ bản 1): GV chiếu tranh minh họa câu chuyện về thanh phách và mở đoạn âm thanh tiếng phách gõ</w:t>
-            </w:r>
-          </w:p>
-          <w:p>
-            <w:pPr>
-              <w:spacing w:after="0"/>
-            </w:pPr>
-            <w:r>
-              <w:rPr>
-                <w:b w:val="0"/>
-                <w:i w:val="0"/>
-                <w:sz w:val="18"/>
-              </w:rPr>
-              <w:t>AI-NB (Cơ bản 1): GV mở một ứng dụng AI tạo hình ảnh, nhập yêu cầu vẽ “hai thanh phách bằng tre”</w:t>
-            </w:r>
-          </w:p>
-          <w:p>
-            <w:pPr>
-              <w:spacing w:after="0"/>
-            </w:pPr>
-            <w:r>
-              <w:rPr>
-                <w:b w:val="0"/>
-                <w:i w:val="0"/>
-                <w:sz w:val="18"/>
-              </w:rPr>
-              <w:t>NLS-AT: Hình do máy vẽ chỉ để so sánh, thanh phách thật mới là chuẩn; âm thanh</w:t>
+              <w:t>NLS-KT (Cơ bản 1): Chiếu tranh minh họa câu chuyện về thanh phách và mở đoạn âm thanh tiếng phách gõ, đoạn hát dân ca có.</w:t>
             </w:r>
           </w:p>
         </w:tc>
@@ -3974,33 +3428,7 @@
                 <w:i w:val="0"/>
                 <w:sz w:val="18"/>
               </w:rPr>
-              <w:t>NLS-KT (Cơ bản 1): GV chiếu hình tiết tấu 1, 2 trên màn hình, bấm phát tiếng phách mẫu theo từng hình để HS nghe rồi gõ theo</w:t>
-            </w:r>
-          </w:p>
-          <w:p>
-            <w:pPr>
-              <w:spacing w:after="0"/>
-            </w:pPr>
-            <w:r>
-              <w:rPr>
-                <w:b w:val="0"/>
-                <w:i w:val="0"/>
-                <w:sz w:val="18"/>
-              </w:rPr>
-              <w:t>NLS-ST (Cơ bản 1): GV ghi âm cả lớp hát Gà gáy kết hợp gõ thanh phách rồi mở lại qua loa; HS nghe và nhận xét tiếng phách đã đều</w:t>
-            </w:r>
-          </w:p>
-          <w:p>
-            <w:pPr>
-              <w:spacing w:after="0"/>
-            </w:pPr>
-            <w:r>
-              <w:rPr>
-                <w:b w:val="0"/>
-                <w:i w:val="0"/>
-                <w:sz w:val="18"/>
-              </w:rPr>
-              <w:t>NLS-AT: HS ngồi cách màn hình đủ xa, không nhìn quá lâu; loa mở vừa đủ nghe</w:t>
+              <w:t>NLS-ST (Cơ bản 1): Ghi âm cả lớp hát Gà gáy kết hợp gõ thanh phách.</w:t>
             </w:r>
           </w:p>
         </w:tc>
@@ -4117,33 +3545,7 @@
                 <w:i w:val="0"/>
                 <w:sz w:val="18"/>
               </w:rPr>
-              <w:t>NLS-KT (Cơ bản 1): GV mở từ học liệu số các tiếng gà gáy dài – ngắn khác nhau kèm hình nét dài – nét ngắn trên màn hình</w:t>
-            </w:r>
-          </w:p>
-          <w:p>
-            <w:pPr>
-              <w:spacing w:after="0"/>
-            </w:pPr>
-            <w:r>
-              <w:rPr>
-                <w:b w:val="0"/>
-                <w:i w:val="0"/>
-                <w:sz w:val="18"/>
-              </w:rPr>
-              <w:t>NLS-GT (Cơ bản 1): GV dùng điện thoại ghi âm cả lớp gáy “ò ó o” thật hay và nói lời chào buổi sáng</w:t>
-            </w:r>
-          </w:p>
-          <w:p>
-            <w:pPr>
-              <w:spacing w:after="0"/>
-            </w:pPr>
-            <w:r>
-              <w:rPr>
-                <w:b w:val="0"/>
-                <w:i w:val="0"/>
-                <w:sz w:val="18"/>
-              </w:rPr>
-              <w:t>NLS-AT: Lời nhắn chỉ có giọng cả lớp, không nêu tên riêng, không kèm hình mặt HS</w:t>
+              <w:t>NLS-KT (Cơ bản 1): Mở từ học liệu số các tiếng gà gáy dài.</w:t>
             </w:r>
           </w:p>
           <w:p>
@@ -4273,33 +3675,7 @@
                 <w:i w:val="0"/>
                 <w:sz w:val="18"/>
               </w:rPr>
-              <w:t>NLS-KT (Cơ bản 1): GV mở bản hát mẫu bài “Cây gia đình” từ học liệu số, chiếu màn hình có tên bài</w:t>
-            </w:r>
-          </w:p>
-          <w:p>
-            <w:pPr>
-              <w:spacing w:after="0"/>
-            </w:pPr>
-            <w:r>
-              <w:rPr>
-                <w:b w:val="0"/>
-                <w:i w:val="0"/>
-                <w:sz w:val="18"/>
-              </w:rPr>
-              <w:t>NLS-ST (Cơ bản 1): GV dùng điện thoại ghi âm cả lớp hát bài Cây gia đình kết hợp gõ đệm, mở lại qua loa</w:t>
-            </w:r>
-          </w:p>
-          <w:p>
-            <w:pPr>
-              <w:spacing w:after="0"/>
-            </w:pPr>
-            <w:r>
-              <w:rPr>
-                <w:b w:val="0"/>
-                <w:i w:val="0"/>
-                <w:sz w:val="18"/>
-              </w:rPr>
-              <w:t>NLS-AT: Bản thu chỉ lấy từ học liệu bộ sách hoặc kênh chính thức</w:t>
+              <w:t>NLS-ST (Cơ bản 1): Dùng điện thoại ghi âm cả lớp hát bài Cây gia đình kết hợp gõ đệm, mở lại qua loa.</w:t>
             </w:r>
           </w:p>
         </w:tc>
@@ -4416,33 +3792,7 @@
                 <w:i w:val="0"/>
                 <w:sz w:val="18"/>
               </w:rPr>
-              <w:t>NLS-KT (Cơ bản 1): GV mở bản đọc nhạc mẫu Hát cùng Đô – Rê – Mi – Pha – Son từ học liệu số</w:t>
-            </w:r>
-          </w:p>
-          <w:p>
-            <w:pPr>
-              <w:spacing w:after="0"/>
-            </w:pPr>
-            <w:r>
-              <w:rPr>
-                <w:b w:val="0"/>
-                <w:i w:val="0"/>
-                <w:sz w:val="18"/>
-              </w:rPr>
-              <w:t>NLS-ST (Cơ bản 1): GV dùng điện thoại quay đoạn ngắn cả lớp đọc nhạc kết hợp kí hiệu bàn tay, mở lại trên màn hình</w:t>
-            </w:r>
-          </w:p>
-          <w:p>
-            <w:pPr>
-              <w:spacing w:after="0"/>
-            </w:pPr>
-            <w:r>
-              <w:rPr>
-                <w:b w:val="0"/>
-                <w:i w:val="0"/>
-                <w:sz w:val="18"/>
-              </w:rPr>
-              <w:t>NLS-AT: Bản đọc nhạc mẫu lấy từ học liệu của bộ sách, không tải từ trang lạ</w:t>
+              <w:t>NLS-KT (Cơ bản 1): Mở bản đọc nhạc mẫu Hát cùng Đô – Rê – Mi – Pha – Son từ học liệu số, chiếu hình.</w:t>
             </w:r>
           </w:p>
         </w:tc>
@@ -4559,33 +3909,7 @@
                 <w:i w:val="0"/>
                 <w:sz w:val="18"/>
               </w:rPr>
-              <w:t>NLS-KT (Cơ bản 1): GV mở bản thu Con chim vành khuyên từ học liệu số, chiếu tranh minh họa cùng tên bài, tên nhạc sĩ Hoàng Vân</w:t>
-            </w:r>
-          </w:p>
-          <w:p>
-            <w:pPr>
-              <w:spacing w:after="0"/>
-            </w:pPr>
-            <w:r>
-              <w:rPr>
-                <w:b w:val="0"/>
-                <w:i w:val="0"/>
-                <w:sz w:val="18"/>
-              </w:rPr>
-              <w:t>NLS-GT (Cơ bản 1): GV gửi bản thu bài hát lên nhóm lớp (Zalo) để cha mẹ mở cho HS nghe lại ở nhà và kể lại nội dung bài</w:t>
-            </w:r>
-          </w:p>
-          <w:p>
-            <w:pPr>
-              <w:spacing w:after="0"/>
-            </w:pPr>
-            <w:r>
-              <w:rPr>
-                <w:b w:val="0"/>
-                <w:i w:val="0"/>
-                <w:sz w:val="18"/>
-              </w:rPr>
-              <w:t>NLS-AT: Bản thu lấy từ học liệu bộ sách, không tải từ trang lạ</w:t>
+              <w:t>NLS-GT (Cơ bản 1): Gửi bản thu bài hát lên nhóm lớp (Zalo) để cha mẹ mở cho HS nghe lại ở nhà.</w:t>
             </w:r>
           </w:p>
         </w:tc>
@@ -4702,33 +4026,7 @@
                 <w:i w:val="0"/>
                 <w:sz w:val="18"/>
               </w:rPr>
-              <w:t>NLS-ST (Cơ bản 1): GV dùng điện thoại quay đoạn ngắn trò chơi Ban nhạc “Những người bạn”, mở lại trên màn hình; HS xem lại</w:t>
-            </w:r>
-          </w:p>
-          <w:p>
-            <w:pPr>
-              <w:spacing w:after="0"/>
-            </w:pPr>
-            <w:r>
-              <w:rPr>
-                <w:b w:val="0"/>
-                <w:i w:val="0"/>
-                <w:sz w:val="18"/>
-              </w:rPr>
-              <w:t>NLS-KT (Cơ bản 1): GV mở hai bản thu Cây gia đình và Con chim vành khuyên từ học liệu số, chiếu tranh minh họa từng bài; HS nghe đoạn đầu</w:t>
-            </w:r>
-          </w:p>
-          <w:p>
-            <w:pPr>
-              <w:spacing w:after="0"/>
-            </w:pPr>
-            <w:r>
-              <w:rPr>
-                <w:b w:val="0"/>
-                <w:i w:val="0"/>
-                <w:sz w:val="18"/>
-              </w:rPr>
-              <w:t>NLS-AT: Đoạn quay chỉ để xem tại lớp, không đăng lên mạng khi chưa được cha mẹ đồng ý</w:t>
+              <w:t>NLS-ST (Cơ bản 1): Dùng điện thoại quay đoạn ngắn trò chơi Ban nhạc “Những người bạn”, mở lại trên màn hình.</w:t>
             </w:r>
           </w:p>
           <w:p>
@@ -4858,33 +4156,7 @@
                 <w:i w:val="0"/>
                 <w:sz w:val="18"/>
               </w:rPr>
-              <w:t>NLS-KT (Cơ bản 1): GV mở bản hát mẫu Ngôi sao lấp lánh từ học liệu số, chiếu tên bài cùng dòng “Nhạc nước ngoài</w:t>
-            </w:r>
-          </w:p>
-          <w:p>
-            <w:pPr>
-              <w:spacing w:after="0"/>
-            </w:pPr>
-            <w:r>
-              <w:rPr>
-                <w:b w:val="0"/>
-                <w:i w:val="0"/>
-                <w:sz w:val="18"/>
-              </w:rPr>
-              <w:t>NLS-ST (Cơ bản 1): GV dùng điện thoại ghi âm lớp hát kết hợp vỗ tay theo phách, mở lại qua loa; HS nghe, chỉ ra chỗ hát chưa rõ lời</w:t>
-            </w:r>
-          </w:p>
-          <w:p>
-            <w:pPr>
-              <w:spacing w:after="0"/>
-            </w:pPr>
-            <w:r>
-              <w:rPr>
-                <w:b w:val="0"/>
-                <w:i w:val="0"/>
-                <w:sz w:val="18"/>
-              </w:rPr>
-              <w:t>NLS-AT: Bản thu lấy từ học liệu bộ sách hoặc kênh chính thức</w:t>
+              <w:t>NLS-KT (Cơ bản 1): Mở bản hát mẫu Ngôi sao lấp lánh từ học liệu số, chiếu tên bài cùng dòng “Nhạc nước ngoài, lời Việt: Thanh Vân sưu tầm và biên soạn”.</w:t>
             </w:r>
           </w:p>
         </w:tc>
@@ -5001,33 +4273,7 @@
                 <w:i w:val="0"/>
                 <w:sz w:val="18"/>
               </w:rPr>
-              <w:t>NLS-KT (Cơ bản 1): GV chiếu ảnh hoặc đoạn video ngắn từ học liệu số về trai-en-gô trong dàn nhạc, mở âm thanh mẫu</w:t>
-            </w:r>
-          </w:p>
-          <w:p>
-            <w:pPr>
-              <w:spacing w:after="0"/>
-            </w:pPr>
-            <w:r>
-              <w:rPr>
-                <w:b w:val="0"/>
-                <w:i w:val="0"/>
-                <w:sz w:val="18"/>
-              </w:rPr>
-              <w:t>NLS-ST (Cơ bản 1): GV ghi âm nhóm gõ đệm trai-en-gô cho bài hát, mở lại qua loa; HS nghe, nói tiếng gõ đã đều phách chưa</w:t>
-            </w:r>
-          </w:p>
-          <w:p>
-            <w:pPr>
-              <w:spacing w:after="0"/>
-            </w:pPr>
-            <w:r>
-              <w:rPr>
-                <w:b w:val="0"/>
-                <w:i w:val="0"/>
-                <w:sz w:val="18"/>
-              </w:rPr>
-              <w:t>NLS-AT: GV dặn HS không gõ dùi hay nhạc cụ lên máy tính, loa</w:t>
+              <w:t>NLS-ST (Cơ bản 1): Ghi âm nhóm gõ đệm trai-en-gô cho bài hát, mở lại qua loa.</w:t>
             </w:r>
           </w:p>
         </w:tc>

</xml_diff>

<commit_message>
Website + web-chung dung lai theo nen SGV (36 cap mon x khoi), cot 7 xuat lai 8/9/2026
Co-Authored-By: Claude Fable 5.1 <noreply@anthropic.com>
Claude-Session: https://claude.ai/code/session_01CH3DVFLNt2eFwxeEQw5xK2
</commit_message>
<xml_diff>
--- a/assets/docs/lop1/Am nhac - Lop 1.docx
+++ b/assets/docs/lop1/Am nhac - Lop 1.docx
@@ -624,7 +624,7 @@
                 <w:i w:val="0"/>
                 <w:sz w:val="18"/>
               </w:rPr>
-              <w:t>NLS-KT (Cơ bản 1): Mở bản hát mẫu bài “Vào rừng hoa” từ học liệu số của bộ sách, chiếu màn hình.</w:t>
+              <w:t>NLS: Năng lực số 3.3 CB1a: HS nói được tên bài hát cùng tên tác giả Việt Anh</w:t>
             </w:r>
           </w:p>
         </w:tc>
@@ -741,7 +741,7 @@
                 <w:i w:val="0"/>
                 <w:sz w:val="18"/>
               </w:rPr>
-              <w:t>NLS-ST (Cơ bản 1): Ghi âm phần cả lớp tạo "cơn mưa rừng" bằng tay chân, mở lại qua loa.</w:t>
+              <w:t>Năng lực số 1.1 CB1a: HS nghe các đoạn âm thanh GV mở từ học liệu số và nói được đó là tiếng gì</w:t>
             </w:r>
           </w:p>
         </w:tc>
@@ -858,7 +858,20 @@
                 <w:i w:val="0"/>
                 <w:sz w:val="18"/>
               </w:rPr>
-              <w:t>NLS-KT (Cơ bản 1): Chiếu hình bậc thang Đô – Rê.</w:t>
+              <w:t>Rê; Mi trên màn hình và nghe tiếng đàn để nói được nốt nào cao, nốt nào thấp</w:t>
+            </w:r>
+          </w:p>
+          <w:p>
+            <w:pPr>
+              <w:spacing w:after="0"/>
+            </w:pPr>
+            <w:r>
+              <w:rPr>
+                <w:b w:val="0"/>
+                <w:i w:val="0"/>
+                <w:sz w:val="18"/>
+              </w:rPr>
+              <w:t>NLS: Năng lực số 1.1 CB1a: HS nhìn hình bậc thang Đô</w:t>
             </w:r>
           </w:p>
         </w:tc>
@@ -975,7 +988,20 @@
                 <w:i w:val="0"/>
                 <w:sz w:val="18"/>
               </w:rPr>
-              <w:t>NLS-ST (Cơ bản 1): Dùng điện thoại ghi âm phần cả lớp đọc Đô.</w:t>
+              <w:t>nhỏ của lớp và nghe lại</w:t>
+            </w:r>
+          </w:p>
+          <w:p>
+            <w:pPr>
+              <w:spacing w:after="0"/>
+            </w:pPr>
+            <w:r>
+              <w:rPr>
+                <w:b w:val="0"/>
+                <w:i w:val="0"/>
+                <w:sz w:val="18"/>
+              </w:rPr>
+              <w:t>NLS: Năng lực số 3.1 CB1a: HS cùng GV tạo bản ghi âm đoạn đọc to</w:t>
             </w:r>
           </w:p>
           <w:p>
@@ -1105,7 +1131,7 @@
                 <w:i w:val="0"/>
                 <w:sz w:val="18"/>
               </w:rPr>
-              <w:t>NLS-KT (Cơ bản 1): Mở bản hát mẫu bài “Tổ quốc ta” từ học liệu số của bộ sách.</w:t>
+              <w:t>NLS: Năng lực số 3.3 CB1a: HS nói được tên bài hát Tổ quốc ta cùng tên tác giả Mộng Lân</w:t>
             </w:r>
           </w:p>
           <w:p>
@@ -1235,7 +1261,7 @@
                 <w:i w:val="0"/>
                 <w:sz w:val="18"/>
               </w:rPr>
-              <w:t>NLS-ST (Cơ bản 1): Ghi âm phần nhóm gõ trống con theo hình tiết tấu.</w:t>
+              <w:t>Năng lực số 1.1 CB1a: HS xem đoạn phim ngắn GV mở và nói được trống con được gõ như thế nào, dùng ở đâu</w:t>
             </w:r>
           </w:p>
           <w:p>
@@ -1365,7 +1391,7 @@
                 <w:i w:val="0"/>
                 <w:sz w:val="18"/>
               </w:rPr>
-              <w:t>NLS-KT (Cơ bản 1): Mở bản thu Quốc ca từ học liệu chính thức, chiếu hình lá cờ Tổ quốc.</w:t>
+              <w:t>NLS: Năng lực số 3.3 CB1a: HS nói được bài Quốc ca do nhạc sĩ Văn Cao sáng tác</w:t>
             </w:r>
           </w:p>
           <w:p>
@@ -1495,7 +1521,7 @@
                 <w:i w:val="0"/>
                 <w:sz w:val="18"/>
               </w:rPr>
-              <w:t>NLS-ST (Cơ bản 1): Ghi âm phần cả lớp hát "la" nhắc lại mẫu cao.</w:t>
+              <w:t>Năng lực số 1.1 CB1a: HS nghe âm thanh GV mở từ học liệu số và nói được âm nào cao, âm nào thấp</w:t>
             </w:r>
           </w:p>
           <w:p>
@@ -1625,7 +1651,7 @@
                 <w:i w:val="0"/>
                 <w:sz w:val="18"/>
               </w:rPr>
-              <w:t>NLS-KT (Cơ bản 1): Mở bản hát mẫu bài “Lớp Một thân yêu” từ học liệu số của bộ sách.</w:t>
+              <w:t>Năng lực số 3.3 CB1a: HS nói được tên bài hát Lớp Một thân yêu cùng tên tác giả Bùi Anh Tôn</w:t>
             </w:r>
           </w:p>
         </w:tc>
@@ -1742,7 +1768,7 @@
                 <w:i w:val="0"/>
                 <w:sz w:val="18"/>
               </w:rPr>
-              <w:t>NLS-ST (Cơ bản 1): Dùng điện thoại quay ngắn phần “ban nhạc Đô – Rê – Mi” của một nhóm.</w:t>
+              <w:t>Năng lực số 1.1 CB1a: HS nhìn màn hình nhận ra hình bàn tay ứng với nốt Đô, Rê, Mi khi GV chiếu</w:t>
             </w:r>
           </w:p>
         </w:tc>
@@ -1859,7 +1885,7 @@
                 <w:i w:val="0"/>
                 <w:sz w:val="18"/>
               </w:rPr>
-              <w:t>NLS-KT (Cơ bản 1): Mở bản thu bài “Những bông hoa những bài ca” từ học liệu số, chiếu màn hình.</w:t>
+              <w:t>NLS: Năng lực số 3.3 CB1a: HS nói được tên bài nghe nhạc và tên tác giả Hoàng Long</w:t>
             </w:r>
           </w:p>
         </w:tc>
@@ -1976,7 +2002,7 @@
                 <w:i w:val="0"/>
                 <w:sz w:val="18"/>
               </w:rPr>
-              <w:t>NLS-ST (Cơ bản 1): Ghi âm một nhóm đọc câu nhạc Đô.</w:t>
+              <w:t>Năng lực số 1.1 CB1a: HS nhìn hình sóng âm trên màn hình và nói âm thanh nào to, âm thanh nào nhỏ</w:t>
             </w:r>
           </w:p>
           <w:p>
@@ -2106,7 +2132,7 @@
                 <w:i w:val="0"/>
                 <w:sz w:val="18"/>
               </w:rPr>
-              <w:t>NLS-KT (Cơ bản 1): Mở bản hát mẫu bài “Chào người bạn mới đến” từ học liệu số, chiếu màn hình.</w:t>
+              <w:t>NLS: Năng lực số 3.3 CB1a: HS nói được tên bài hát và tên tác giả Lương Bằng Vinh</w:t>
             </w:r>
           </w:p>
         </w:tc>
@@ -2223,7 +2249,7 @@
                 <w:i w:val="0"/>
                 <w:sz w:val="18"/>
               </w:rPr>
-              <w:t>NLS-ST (Cơ bản 1): Dùng điện thoại ghi âm phần cả lớp hát kết hợp gõ trống đệm theo phách, mở lại qua loa.</w:t>
+              <w:t>NLS: Năng lực số 1.1 CB1a: HS xem video ngắn và nói lại được cách cầm dùi, cách gõ trống con</w:t>
             </w:r>
           </w:p>
         </w:tc>
@@ -2340,7 +2366,7 @@
                 <w:i w:val="0"/>
                 <w:sz w:val="18"/>
               </w:rPr>
-              <w:t>NLS-KT (Cơ bản 1): Chiếu hình và video ngắn trống cái ở trường học, lễ hội lấy từ học liệu số, bật lần lượt tiếng trống.</w:t>
+              <w:t>Năng lực số 1.1 CB1a: HS xem hình, nghe âm thanh trên màn hình và nói được đó là trống cái hay trống con</w:t>
             </w:r>
           </w:p>
         </w:tc>
@@ -2457,6 +2483,7 @@
                 <w:i w:val="0"/>
                 <w:sz w:val="18"/>
               </w:rPr>
+              <w:t>NLS: Năng lực số 1.1 CB1a: HS nhìn tranh và nghe đoạn nhạc trên màn hình để nói tên bài hát</w:t>
             </w:r>
           </w:p>
         </w:tc>
@@ -2573,6 +2600,20 @@
                 <w:i w:val="0"/>
                 <w:sz w:val="18"/>
               </w:rPr>
+              <w:t>không tự chạm vào thiết bị</w:t>
+            </w:r>
+          </w:p>
+          <w:p>
+            <w:pPr>
+              <w:spacing w:after="0"/>
+            </w:pPr>
+            <w:r>
+              <w:rPr>
+                <w:b w:val="0"/>
+                <w:i w:val="0"/>
+                <w:sz w:val="18"/>
+              </w:rPr>
+              <w:t>NLS: Năng lực số 4.1 CB1a: HS đứng đúng vị trí trước máy quay, micro</w:t>
             </w:r>
           </w:p>
         </w:tc>
@@ -2689,7 +2730,7 @@
                 <w:i w:val="0"/>
                 <w:sz w:val="18"/>
               </w:rPr>
-              <w:t>NLS-ST (Cơ bản 1): Dùng điện thoại ghi âm cả lớp hát kết hợp gõ đệm theo phách.</w:t>
+              <w:t>Năng lực số 3.3 CB1a: HS nói được tên bài hát cùng tên tác giả phần nhạc và nguồn lời ca phỏng theo đồng dao</w:t>
             </w:r>
           </w:p>
         </w:tc>
@@ -2830,7 +2871,7 @@
                 <w:i w:val="0"/>
                 <w:sz w:val="18"/>
               </w:rPr>
-              <w:t>NLS-KT (Cơ bản 1): Chiếu hình 5 nốt Đô – Rê.</w:t>
+              <w:t>Năng lực số 1.1 CB1a: HS nhìn hình kí hiệu bàn tay trên màn hình, nói đúng tên nốt Pha, Son</w:t>
             </w:r>
           </w:p>
         </w:tc>
@@ -2947,7 +2988,7 @@
                 <w:i w:val="0"/>
                 <w:sz w:val="18"/>
               </w:rPr>
-              <w:t>AI-NB (Nhận biết): Dùng một ứng dụng AI đọc to đoạn ngắn kể về tuổi thơ Mô-da bằng giọng máy, hỏi.</w:t>
+              <w:t>Năng lực số 1.1 CB1a: HS xem hình, nghe GV giới thiệu và nói được tên nhạc sĩ Mô-da, tên bản nhạc vừa nghe</w:t>
             </w:r>
           </w:p>
         </w:tc>
@@ -3064,7 +3105,20 @@
                 <w:i w:val="0"/>
                 <w:sz w:val="18"/>
               </w:rPr>
-              <w:t>NLS-KT (Cơ bản 1): Mở từ học liệu số các đoạn âm thanh dài – ngắn (tiếng còi tàu, tiếng chim hót, tiếng chuông), chiếu.</w:t>
+              <w:t>ngắn để GV ghi âm, nghe lại và nhận xét</w:t>
+            </w:r>
+          </w:p>
+          <w:p>
+            <w:pPr>
+              <w:spacing w:after="0"/>
+            </w:pPr>
+            <w:r>
+              <w:rPr>
+                <w:b w:val="0"/>
+                <w:i w:val="0"/>
+                <w:sz w:val="18"/>
+              </w:rPr>
+              <w:t>NLS: Năng lực số 3.1 CB1a: HS thể hiện âm thanh dài</w:t>
             </w:r>
           </w:p>
           <w:p>
@@ -3194,7 +3248,7 @@
                 <w:i w:val="0"/>
                 <w:sz w:val="18"/>
               </w:rPr>
-              <w:t>NLS-ST (Cơ bản 1): Dùng điện thoại ghi âm cả lớp hát kết hợp gõ đệm.</w:t>
+              <w:t>Năng lực số 3.3 CB1a: HS nói được bài Gà gáy là dân ca Cống Khao và người viết lời mới là Huy Trân</w:t>
             </w:r>
           </w:p>
         </w:tc>
@@ -3311,7 +3365,7 @@
                 <w:i w:val="0"/>
                 <w:sz w:val="18"/>
               </w:rPr>
-              <w:t>NLS-KT (Cơ bản 1): Chiếu tranh minh họa câu chuyện về thanh phách và mở đoạn âm thanh tiếng phách gõ, đoạn hát dân ca có.</w:t>
+              <w:t>Năng lực số 1.1 CB1a: HS xem hình, nghe âm thanh trên màn hình và nói đúng tên nhạc cụ thanh phách</w:t>
             </w:r>
           </w:p>
         </w:tc>
@@ -3428,7 +3482,7 @@
                 <w:i w:val="0"/>
                 <w:sz w:val="18"/>
               </w:rPr>
-              <w:t>NLS-ST (Cơ bản 1): Ghi âm cả lớp hát Gà gáy kết hợp gõ thanh phách.</w:t>
+              <w:t>Năng lực số 4.1 CB1a: HS ngồi đúng khoảng cách với màn hình, nghe loa vừa đủ khi xem, nghe bài Lí cây bông</w:t>
             </w:r>
           </w:p>
         </w:tc>
@@ -3545,7 +3599,7 @@
                 <w:i w:val="0"/>
                 <w:sz w:val="18"/>
               </w:rPr>
-              <w:t>NLS-KT (Cơ bản 1): Mở từ học liệu số các tiếng gà gáy dài.</w:t>
+              <w:t>Năng lực số 2.1 CB1a: HS nói lời chào buổi sáng để GV ghi lại thành lời nhắn gửi bạn lớp bên</w:t>
             </w:r>
           </w:p>
           <w:p>
@@ -3675,7 +3729,7 @@
                 <w:i w:val="0"/>
                 <w:sz w:val="18"/>
               </w:rPr>
-              <w:t>NLS-ST (Cơ bản 1): Dùng điện thoại ghi âm cả lớp hát bài Cây gia đình kết hợp gõ đệm, mở lại qua loa.</w:t>
+              <w:t>NLS: Năng lực số 3.3 CB1a: HS nói được tên bài hát cùng tên tác giả nhạc và tác giả lời thơ</w:t>
             </w:r>
           </w:p>
         </w:tc>
@@ -3792,7 +3846,7 @@
                 <w:i w:val="0"/>
                 <w:sz w:val="18"/>
               </w:rPr>
-              <w:t>NLS-KT (Cơ bản 1): Mở bản đọc nhạc mẫu Hát cùng Đô – Rê – Mi – Pha – Son từ học liệu số, chiếu hình.</w:t>
+              <w:t>Năng lực số 1.1 CB1a: HS nghe bản đọc nhạc mẫu từ học liệu số, nói được tên 5 nốt vừa nghe theo thứ tự</w:t>
             </w:r>
           </w:p>
         </w:tc>
@@ -3909,7 +3963,7 @@
                 <w:i w:val="0"/>
                 <w:sz w:val="18"/>
               </w:rPr>
-              <w:t>NLS-GT (Cơ bản 1): Gửi bản thu bài hát lên nhóm lớp (Zalo) để cha mẹ mở cho HS nghe lại ở nhà.</w:t>
+              <w:t>Năng lực số 3.3 CB1a: HS nói được tên bài hát Con chim vành khuyên và tên nhạc sĩ Hoàng Vân</w:t>
             </w:r>
           </w:p>
         </w:tc>
@@ -4026,7 +4080,7 @@
                 <w:i w:val="0"/>
                 <w:sz w:val="18"/>
               </w:rPr>
-              <w:t>NLS-ST (Cơ bản 1): Dùng điện thoại quay đoạn ngắn trò chơi Ban nhạc “Những người bạn”, mở lại trên màn hình.</w:t>
+              <w:t>Năng lực số 3.1 CB1a: HS cùng GV tạo được một đoạn ghi hình ban nhạc lớp và xem lại để nhận xét</w:t>
             </w:r>
           </w:p>
           <w:p>
@@ -4156,7 +4210,7 @@
                 <w:i w:val="0"/>
                 <w:sz w:val="18"/>
               </w:rPr>
-              <w:t>NLS-KT (Cơ bản 1): Mở bản hát mẫu Ngôi sao lấp lánh từ học liệu số, chiếu tên bài cùng dòng “Nhạc nước ngoài, lời Việt: Thanh Vân sưu tầm và biên soạn”.</w:t>
+              <w:t>Năng lực số 3.3 CB1a: HS nói được tên bài hát và biết đây là bài hát nước ngoài có lời Việt do Thanh Vân sưu tầm, biên soạn</w:t>
             </w:r>
           </w:p>
         </w:tc>
@@ -4273,7 +4327,7 @@
                 <w:i w:val="0"/>
                 <w:sz w:val="18"/>
               </w:rPr>
-              <w:t>NLS-ST (Cơ bản 1): Ghi âm nhóm gõ đệm trai-en-gô cho bài hát, mở lại qua loa.</w:t>
+              <w:t>Năng lực số 4.1 CB1a: HS nêu được cách dùng loa, máy tính an toàn trong lớp (không chạm dây điện, không gõ nhạc cụ lên thiết bị)</w:t>
             </w:r>
           </w:p>
         </w:tc>
@@ -4390,6 +4444,7 @@
                 <w:i w:val="0"/>
                 <w:sz w:val="18"/>
               </w:rPr>
+              <w:t>Năng lực số 1.1 CB1a: HS nghe âm thanh mẫu của 3 nhạc cụ từ học liệu số, nói đúng tên nhạc cụ vừa nghe</w:t>
             </w:r>
           </w:p>
         </w:tc>
@@ -4506,6 +4561,7 @@
                 <w:i w:val="0"/>
                 <w:sz w:val="18"/>
               </w:rPr>
+              <w:t>NLS: Năng lực số 3.3 CB1a: HS nói được tên bài hát và tên tác giả khi giới thiệu bài trình bày</w:t>
             </w:r>
           </w:p>
         </w:tc>
@@ -4622,6 +4678,7 @@
                 <w:i w:val="0"/>
                 <w:sz w:val="18"/>
               </w:rPr>
+              <w:t>NLS: Năng lực số 3.3 CB1a: HS giới thiệu được tên bài, tên tác giả trước khi trình bày</w:t>
             </w:r>
           </w:p>
         </w:tc>
@@ -4738,6 +4795,7 @@
                 <w:i w:val="0"/>
                 <w:sz w:val="18"/>
               </w:rPr>
+              <w:t>Năng lực số 2.1 CB1a: HS biết cùng cha mẹ xem lại video biểu diễn của lớp do GV gửi qua nhóm lớp và kể lại bài mình đã trình bày</w:t>
             </w:r>
           </w:p>
         </w:tc>

</xml_diff>

<commit_message>
docx-to-json: thôi cắt câu ở dấu gạch giữa dòng — câu Năng lực số trên website không còn bị xé đôi
Bộ tách cột 7 cắt ở mọi dấu gạch có khoảng trắng hai bên nên câu "…rồi hỏi – đáp theo cặp…" và câu có
tên bài trong ngoặc kép ("My friends — Lesson 2") bị đứt làm đôi; mẩu đầu dưới 90 kí tự lại bị nhận nhầm
là nhãn tích hợp, in ra thành thẻ cụt còn phần sau thành câu lửng. Nay chỉ cắt ở dấu ";", xuống dòng và
gạch đầu dòng. Sinh lại cả 51 KHDH: bớt 115 thẻ tích hợp giả, câu đầy đủ trở lại.

Co-Authored-By: Claude Opus 5 <noreply@anthropic.com>
</commit_message>
<xml_diff>
--- a/assets/docs/lop1/Am nhac - Lop 1.docx
+++ b/assets/docs/lop1/Am nhac - Lop 1.docx
@@ -858,20 +858,7 @@
                 <w:i w:val="0"/>
                 <w:sz w:val="18"/>
               </w:rPr>
-              <w:t>Rê; Mi trên màn hình và nghe tiếng đàn để nói được nốt nào cao, nốt nào thấp</w:t>
-            </w:r>
-          </w:p>
-          <w:p>
-            <w:pPr>
-              <w:spacing w:after="0"/>
-            </w:pPr>
-            <w:r>
-              <w:rPr>
-                <w:b w:val="0"/>
-                <w:i w:val="0"/>
-                <w:sz w:val="18"/>
-              </w:rPr>
-              <w:t>NLS: Năng lực số 1.1 CB1a: HS nhìn hình bậc thang Đô</w:t>
+              <w:t>Năng lực số 1.1 CB1a: HS nhìn hình bậc thang Đô – Rê – Mi trên màn hình và nghe tiếng đàn để nói được nốt nào cao, nốt nào thấp</w:t>
             </w:r>
           </w:p>
         </w:tc>
@@ -988,20 +975,7 @@
                 <w:i w:val="0"/>
                 <w:sz w:val="18"/>
               </w:rPr>
-              <w:t>nhỏ của lớp và nghe lại</w:t>
-            </w:r>
-          </w:p>
-          <w:p>
-            <w:pPr>
-              <w:spacing w:after="0"/>
-            </w:pPr>
-            <w:r>
-              <w:rPr>
-                <w:b w:val="0"/>
-                <w:i w:val="0"/>
-                <w:sz w:val="18"/>
-              </w:rPr>
-              <w:t>NLS: Năng lực số 3.1 CB1a: HS cùng GV tạo bản ghi âm đoạn đọc to</w:t>
+              <w:t>NLS: Năng lực số 3.1 CB1a: HS cùng GV tạo bản ghi âm đoạn đọc to – nhỏ của lớp và nghe lại</w:t>
             </w:r>
           </w:p>
           <w:p>
@@ -3105,20 +3079,7 @@
                 <w:i w:val="0"/>
                 <w:sz w:val="18"/>
               </w:rPr>
-              <w:t>ngắn để GV ghi âm, nghe lại và nhận xét</w:t>
-            </w:r>
-          </w:p>
-          <w:p>
-            <w:pPr>
-              <w:spacing w:after="0"/>
-            </w:pPr>
-            <w:r>
-              <w:rPr>
-                <w:b w:val="0"/>
-                <w:i w:val="0"/>
-                <w:sz w:val="18"/>
-              </w:rPr>
-              <w:t>NLS: Năng lực số 3.1 CB1a: HS thể hiện âm thanh dài</w:t>
+              <w:t>NLS: Năng lực số 3.1 CB1a: HS thể hiện âm thanh dài – ngắn để GV ghi âm, nghe lại và nhận xét</w:t>
             </w:r>
           </w:p>
           <w:p>

</xml_diff>